<commit_message>
recent lab changes: 2025-12-19 11:20:34
</commit_message>
<xml_diff>
--- a/Курс 3/Базы данных/Лабораторные/05. SQL/Документ Microsoft Word.docx
+++ b/Курс 3/Базы данных/Лабораторные/05. SQL/Документ Microsoft Word.docx
@@ -333,7 +333,7 @@
           <w:spacing w:val="-11"/>
           <w:sz w:val="24"/>
           <w:szCs w:val="24"/>
-          <w:lang w:val="en-US" w:eastAsia="ru-RU"/>
+          <w:lang w:eastAsia="ru-RU"/>
         </w:rPr>
       </w:pPr>
       <w:r>
@@ -355,7 +355,7 @@
           <w:spacing w:val="-11"/>
           <w:sz w:val="24"/>
           <w:szCs w:val="24"/>
-          <w:lang w:val="en-US" w:eastAsia="ru-RU"/>
+          <w:lang w:eastAsia="ru-RU"/>
         </w:rPr>
       </w:pPr>
     </w:p>
@@ -370,7 +370,7 @@
           <w:spacing w:val="-11"/>
           <w:sz w:val="24"/>
           <w:szCs w:val="24"/>
-          <w:lang w:val="en-US" w:eastAsia="ru-RU"/>
+          <w:lang w:eastAsia="ru-RU"/>
         </w:rPr>
       </w:pPr>
     </w:p>
@@ -385,7 +385,7 @@
           <w:spacing w:val="-11"/>
           <w:sz w:val="24"/>
           <w:szCs w:val="24"/>
-          <w:lang w:val="en-US" w:eastAsia="ru-RU"/>
+          <w:lang w:eastAsia="ru-RU"/>
         </w:rPr>
       </w:pPr>
     </w:p>
@@ -400,7 +400,7 @@
           <w:spacing w:val="-11"/>
           <w:sz w:val="24"/>
           <w:szCs w:val="24"/>
-          <w:lang w:val="en-US" w:eastAsia="ru-RU"/>
+          <w:lang w:eastAsia="ru-RU"/>
         </w:rPr>
       </w:pPr>
     </w:p>
@@ -415,7 +415,7 @@
           <w:spacing w:val="-11"/>
           <w:sz w:val="24"/>
           <w:szCs w:val="24"/>
-          <w:lang w:val="en-US" w:eastAsia="ru-RU"/>
+          <w:lang w:eastAsia="ru-RU"/>
         </w:rPr>
       </w:pPr>
     </w:p>
@@ -447,6 +447,26 @@
         <w:rPr>
           <w:rFonts w:eastAsia="Times New Roman" w:cs="Times New Roman"/>
           <w:color w:val="000000"/>
+          <w:spacing w:val="-11"/>
+          <w:szCs w:val="28"/>
+          <w:lang w:eastAsia="ru-RU"/>
+        </w:rPr>
+        <w:t xml:space="preserve">    </w:t>
+      </w:r>
+      <w:r>
+        <w:rPr>
+          <w:rFonts w:eastAsia="Times New Roman" w:cs="Times New Roman"/>
+          <w:color w:val="000000"/>
+          <w:spacing w:val="-11"/>
+          <w:szCs w:val="28"/>
+          <w:lang w:val="en-US" w:eastAsia="ru-RU"/>
+        </w:rPr>
+        <w:t xml:space="preserve"> </w:t>
+      </w:r>
+      <w:r>
+        <w:rPr>
+          <w:rFonts w:eastAsia="Times New Roman" w:cs="Times New Roman"/>
+          <w:color w:val="000000"/>
           <w:spacing w:val="-10"/>
           <w:szCs w:val="28"/>
           <w:lang w:eastAsia="ru-RU"/>
@@ -482,6 +502,16 @@
         <w:rPr>
           <w:rFonts w:eastAsia="Times New Roman" w:cs="Times New Roman"/>
           <w:color w:val="000000"/>
+          <w:spacing w:val="-11"/>
+          <w:szCs w:val="28"/>
+          <w:lang w:eastAsia="ru-RU"/>
+        </w:rPr>
+        <w:t xml:space="preserve">     </w:t>
+      </w:r>
+      <w:r>
+        <w:rPr>
+          <w:rFonts w:eastAsia="Times New Roman" w:cs="Times New Roman"/>
+          <w:color w:val="000000"/>
           <w:szCs w:val="28"/>
           <w:lang w:eastAsia="ru-RU"/>
         </w:rPr>
@@ -517,6 +547,16 @@
         <w:rPr>
           <w:rFonts w:eastAsia="Times New Roman" w:cs="Times New Roman"/>
           <w:color w:val="000000"/>
+          <w:spacing w:val="-11"/>
+          <w:szCs w:val="28"/>
+          <w:lang w:eastAsia="ru-RU"/>
+        </w:rPr>
+        <w:t xml:space="preserve">     </w:t>
+      </w:r>
+      <w:r>
+        <w:rPr>
+          <w:rFonts w:eastAsia="Times New Roman" w:cs="Times New Roman"/>
+          <w:color w:val="000000"/>
           <w:szCs w:val="28"/>
           <w:lang w:eastAsia="ru-RU"/>
         </w:rPr>
@@ -546,7 +586,37 @@
           <w:szCs w:val="28"/>
           <w:lang w:eastAsia="ru-RU"/>
         </w:rPr>
-        <w:t xml:space="preserve">                                                                        Проверил: </w:t>
+        <w:t xml:space="preserve">                                                                        </w:t>
+      </w:r>
+      <w:r>
+        <w:rPr>
+          <w:rFonts w:eastAsia="Times New Roman" w:cs="Times New Roman"/>
+          <w:color w:val="000000"/>
+          <w:spacing w:val="-11"/>
+          <w:szCs w:val="28"/>
+          <w:lang w:eastAsia="ru-RU"/>
+        </w:rPr>
+        <w:t xml:space="preserve">    </w:t>
+      </w:r>
+      <w:r>
+        <w:rPr>
+          <w:rFonts w:eastAsia="Times New Roman" w:cs="Times New Roman"/>
+          <w:color w:val="000000"/>
+          <w:spacing w:val="-11"/>
+          <w:szCs w:val="28"/>
+          <w:lang w:val="en-US" w:eastAsia="ru-RU"/>
+        </w:rPr>
+        <w:t xml:space="preserve"> </w:t>
+      </w:r>
+      <w:r>
+        <w:rPr>
+          <w:rFonts w:eastAsia="Times New Roman" w:cs="Times New Roman"/>
+          <w:color w:val="000000"/>
+          <w:spacing w:val="-11"/>
+          <w:szCs w:val="28"/>
+          <w:lang w:eastAsia="ru-RU"/>
+        </w:rPr>
+        <w:t xml:space="preserve">Проверил: </w:t>
       </w:r>
     </w:p>
     <w:p>
@@ -573,6 +643,16 @@
         </w:rPr>
         <w:tab/>
         <w:t xml:space="preserve">                 </w:t>
+      </w:r>
+      <w:r>
+        <w:rPr>
+          <w:rFonts w:eastAsia="Times New Roman" w:cs="Times New Roman"/>
+          <w:color w:val="000000"/>
+          <w:spacing w:val="-11"/>
+          <w:szCs w:val="28"/>
+          <w:lang w:eastAsia="ru-RU"/>
+        </w:rPr>
+        <w:t xml:space="preserve">     </w:t>
       </w:r>
       <w:r>
         <w:rPr>
@@ -875,24 +955,14 @@
       <w:r>
         <w:t xml:space="preserve">Рис. </w:t>
       </w:r>
-      <w:r>
-        <w:fldChar w:fldCharType="begin"/>
-      </w:r>
-      <w:r>
-        <w:instrText xml:space="preserve"> SEQ Рис. \* ARABIC </w:instrText>
-      </w:r>
-      <w:r>
-        <w:fldChar w:fldCharType="separate"/>
-      </w:r>
-      <w:r>
-        <w:rPr>
-          <w:noProof/>
-        </w:rPr>
-        <w:t>1</w:t>
-      </w:r>
-      <w:r>
-        <w:fldChar w:fldCharType="end"/>
-      </w:r>
+      <w:fldSimple w:instr=" SEQ Рис. \* ARABIC ">
+        <w:r>
+          <w:rPr>
+            <w:noProof/>
+          </w:rPr>
+          <w:t>1</w:t>
+        </w:r>
+      </w:fldSimple>
       <w:r>
         <w:t>. Рабочее окно программы</w:t>
       </w:r>
@@ -956,24 +1026,14 @@
       <w:r>
         <w:t xml:space="preserve">Рис. </w:t>
       </w:r>
-      <w:r>
-        <w:fldChar w:fldCharType="begin"/>
-      </w:r>
-      <w:r>
-        <w:instrText xml:space="preserve"> SEQ Рис. \* ARABIC </w:instrText>
-      </w:r>
-      <w:r>
-        <w:fldChar w:fldCharType="separate"/>
-      </w:r>
-      <w:r>
-        <w:rPr>
-          <w:noProof/>
-        </w:rPr>
-        <w:t>2</w:t>
-      </w:r>
-      <w:r>
-        <w:fldChar w:fldCharType="end"/>
-      </w:r>
+      <w:fldSimple w:instr=" SEQ Рис. \* ARABIC ">
+        <w:r>
+          <w:rPr>
+            <w:noProof/>
+          </w:rPr>
+          <w:t>2</w:t>
+        </w:r>
+      </w:fldSimple>
       <w:r>
         <w:t>. Разделение разделов</w:t>
       </w:r>
@@ -2125,7 +2185,6 @@
     </w:p>
     <w:p>
       <w:r>
-        <w:lastRenderedPageBreak/>
         <w:t xml:space="preserve">По размещённым в разделе действиям его можно охарактеризовать как раздел для работы с редактором сценариев (название раздела в программе: </w:t>
       </w:r>
       <w:r>
@@ -2165,6 +2224,7 @@
         <w:rPr>
           <w:lang w:val="en-US"/>
         </w:rPr>
+        <w:lastRenderedPageBreak/>
         <w:t>Refresh</w:t>
       </w:r>
       <w:r>
@@ -2339,13 +2399,7 @@
         <w:t>export</w:t>
       </w:r>
       <w:r>
-        <w:t xml:space="preserve"> – </w:t>
-      </w:r>
-      <w:r>
-        <w:t>экспортировать свойства</w:t>
-      </w:r>
-      <w:r>
-        <w:t xml:space="preserve"> в формате </w:t>
+        <w:t xml:space="preserve"> – экспортировать свойства в формате </w:t>
       </w:r>
       <w:r>
         <w:rPr>
@@ -2381,10 +2435,7 @@
         <w:t>export</w:t>
       </w:r>
       <w:r>
-        <w:t xml:space="preserve"> – </w:t>
-      </w:r>
-      <w:r>
-        <w:t xml:space="preserve">экспортировать свойства в формате </w:t>
+        <w:t xml:space="preserve"> – экспортировать свойства в формате </w:t>
       </w:r>
       <w:r>
         <w:rPr>
@@ -2423,16 +2474,7 @@
         <w:t xml:space="preserve"> </w:t>
       </w:r>
       <w:r>
-        <w:t xml:space="preserve">– </w:t>
-      </w:r>
-      <w:r>
-        <w:t xml:space="preserve">экспортировать свойства в </w:t>
-      </w:r>
-      <w:r>
-        <w:t>файл</w:t>
-      </w:r>
-      <w:r>
-        <w:t xml:space="preserve"> </w:t>
+        <w:t xml:space="preserve">– экспортировать свойства в файл </w:t>
       </w:r>
       <w:r>
         <w:rPr>
@@ -2495,19 +2537,7 @@
         <w:t>DESC</w:t>
       </w:r>
       <w:r>
-        <w:t xml:space="preserve"> </w:t>
-      </w:r>
-      <w:r>
-        <w:t xml:space="preserve">– отсортировать поля таблицы в </w:t>
-      </w:r>
-      <w:r>
-        <w:t>обратном</w:t>
-      </w:r>
-      <w:r>
-        <w:t xml:space="preserve"> порядке</w:t>
-      </w:r>
-      <w:r>
-        <w:t>.</w:t>
+        <w:t xml:space="preserve"> – отсортировать поля таблицы в обратном порядке.</w:t>
       </w:r>
     </w:p>
     <w:p>
@@ -2725,6 +2755,9 @@
         <w:jc w:val="center"/>
       </w:pPr>
       <w:r>
+        <w:rPr>
+          <w:noProof/>
+        </w:rPr>
         <w:lastRenderedPageBreak/>
         <w:drawing>
           <wp:inline distT="0" distB="0" distL="0" distR="0" wp14:anchorId="77619812" wp14:editId="5A77F976">
@@ -2770,34 +2803,19 @@
       <w:r>
         <w:t xml:space="preserve">Рис. </w:t>
       </w:r>
-      <w:r>
-        <w:fldChar w:fldCharType="begin"/>
-      </w:r>
-      <w:r>
-        <w:instrText xml:space="preserve"> SEQ Рис. \* ARABIC </w:instrText>
-      </w:r>
-      <w:r>
-        <w:fldChar w:fldCharType="separate"/>
-      </w:r>
-      <w:r>
-        <w:rPr>
-          <w:noProof/>
-        </w:rPr>
-        <w:t>3</w:t>
-      </w:r>
-      <w:r>
-        <w:fldChar w:fldCharType="end"/>
-      </w:r>
+      <w:fldSimple w:instr=" SEQ Рис. \* ARABIC ">
+        <w:r>
+          <w:rPr>
+            <w:noProof/>
+          </w:rPr>
+          <w:t>3</w:t>
+        </w:r>
+      </w:fldSimple>
       <w:r>
         <w:t>. Окно подключения к базе данных</w:t>
       </w:r>
     </w:p>
     <w:p>
-      <w:pPr>
-        <w:rPr>
-          <w:lang w:val="en-US"/>
-        </w:rPr>
-      </w:pPr>
       <w:r>
         <w:t xml:space="preserve">В этом окне можно выполнить подключение напрямую к одному из множества поддерживаемых серверов СУБД, открыв один из файлов базы данных, используя </w:t>
       </w:r>
@@ -2844,13 +2862,7 @@
         <w:t>.</w:t>
       </w:r>
     </w:p>
-    <w:p>
-      <w:pPr>
-        <w:rPr>
-          <w:lang w:val="en-US"/>
-        </w:rPr>
-      </w:pPr>
-    </w:p>
+    <w:p/>
     <w:p>
       <w:r>
         <w:t>В списке объектов базы данных находятся: описание поддерживаемых типов данных, список таблиц, список сохранённых запросов, синонимы для типов данных, список пользователей и др. Внешний вид списка объектов представлен на рис. 4.</w:t>
@@ -2863,6 +2875,9 @@
         <w:jc w:val="center"/>
       </w:pPr>
       <w:r>
+        <w:rPr>
+          <w:noProof/>
+        </w:rPr>
         <w:drawing>
           <wp:inline distT="0" distB="0" distL="0" distR="0" wp14:anchorId="21E9C66D" wp14:editId="16671F27">
             <wp:extent cx="3578999" cy="2160905"/>
@@ -2907,24 +2922,14 @@
       <w:r>
         <w:t xml:space="preserve">Рис. </w:t>
       </w:r>
-      <w:r>
-        <w:fldChar w:fldCharType="begin"/>
-      </w:r>
-      <w:r>
-        <w:instrText xml:space="preserve"> SEQ Рис. \* ARABIC </w:instrText>
-      </w:r>
-      <w:r>
-        <w:fldChar w:fldCharType="separate"/>
-      </w:r>
-      <w:r>
-        <w:rPr>
-          <w:noProof/>
-        </w:rPr>
-        <w:t>4</w:t>
-      </w:r>
-      <w:r>
-        <w:fldChar w:fldCharType="end"/>
-      </w:r>
+      <w:fldSimple w:instr=" SEQ Рис. \* ARABIC ">
+        <w:r>
+          <w:rPr>
+            <w:noProof/>
+          </w:rPr>
+          <w:t>4</w:t>
+        </w:r>
+      </w:fldSimple>
       <w:r>
         <w:t>. Список объектов в базе данных</w:t>
       </w:r>
@@ -2960,6 +2965,9 @@
         <w:jc w:val="center"/>
       </w:pPr>
       <w:r>
+        <w:rPr>
+          <w:noProof/>
+        </w:rPr>
         <w:drawing>
           <wp:inline distT="0" distB="0" distL="0" distR="0" wp14:anchorId="13889324" wp14:editId="197490A2">
             <wp:extent cx="3336626" cy="1570588"/>
@@ -3004,24 +3012,14 @@
       <w:r>
         <w:t xml:space="preserve">Рис. </w:t>
       </w:r>
-      <w:r>
-        <w:fldChar w:fldCharType="begin"/>
-      </w:r>
-      <w:r>
-        <w:instrText xml:space="preserve"> SEQ Рис. \* ARABIC </w:instrText>
-      </w:r>
-      <w:r>
-        <w:fldChar w:fldCharType="separate"/>
-      </w:r>
-      <w:r>
-        <w:rPr>
-          <w:noProof/>
-        </w:rPr>
-        <w:t>5</w:t>
-      </w:r>
-      <w:r>
-        <w:fldChar w:fldCharType="end"/>
-      </w:r>
+      <w:fldSimple w:instr=" SEQ Рис. \* ARABIC ">
+        <w:r>
+          <w:rPr>
+            <w:noProof/>
+          </w:rPr>
+          <w:t>5</w:t>
+        </w:r>
+      </w:fldSimple>
       <w:r>
         <w:t>. Вкладка текстового представления</w:t>
       </w:r>
@@ -3032,6 +3030,9 @@
         <w:jc w:val="center"/>
       </w:pPr>
       <w:r>
+        <w:rPr>
+          <w:noProof/>
+        </w:rPr>
         <w:drawing>
           <wp:inline distT="0" distB="0" distL="0" distR="0" wp14:anchorId="2E376BBA" wp14:editId="7795CC5F">
             <wp:extent cx="3324764" cy="1586819"/>
@@ -3076,24 +3077,14 @@
       <w:r>
         <w:t xml:space="preserve">Рис. </w:t>
       </w:r>
-      <w:r>
-        <w:fldChar w:fldCharType="begin"/>
-      </w:r>
-      <w:r>
-        <w:instrText xml:space="preserve"> SEQ Рис. \* ARABIC </w:instrText>
-      </w:r>
-      <w:r>
-        <w:fldChar w:fldCharType="separate"/>
-      </w:r>
-      <w:r>
-        <w:rPr>
-          <w:noProof/>
-        </w:rPr>
-        <w:t>6</w:t>
-      </w:r>
-      <w:r>
-        <w:fldChar w:fldCharType="end"/>
-      </w:r>
+      <w:fldSimple w:instr=" SEQ Рис. \* ARABIC ">
+        <w:r>
+          <w:rPr>
+            <w:noProof/>
+          </w:rPr>
+          <w:t>6</w:t>
+        </w:r>
+      </w:fldSimple>
       <w:r>
         <w:t>. Вкладка параметров</w:t>
       </w:r>
@@ -3104,6 +3095,9 @@
         <w:jc w:val="center"/>
       </w:pPr>
       <w:r>
+        <w:rPr>
+          <w:noProof/>
+        </w:rPr>
         <w:drawing>
           <wp:inline distT="0" distB="0" distL="0" distR="0" wp14:anchorId="260BEC1D" wp14:editId="7302214E">
             <wp:extent cx="3579602" cy="1469922"/>
@@ -3148,24 +3142,14 @@
       <w:r>
         <w:t xml:space="preserve">Рис. </w:t>
       </w:r>
-      <w:r>
-        <w:fldChar w:fldCharType="begin"/>
-      </w:r>
-      <w:r>
-        <w:instrText xml:space="preserve"> SEQ Рис. \* ARABIC </w:instrText>
-      </w:r>
-      <w:r>
-        <w:fldChar w:fldCharType="separate"/>
-      </w:r>
-      <w:r>
-        <w:rPr>
-          <w:noProof/>
-        </w:rPr>
-        <w:t>7</w:t>
-      </w:r>
-      <w:r>
-        <w:fldChar w:fldCharType="end"/>
-      </w:r>
+      <w:fldSimple w:instr=" SEQ Рис. \* ARABIC ">
+        <w:r>
+          <w:rPr>
+            <w:noProof/>
+          </w:rPr>
+          <w:t>7</w:t>
+        </w:r>
+      </w:fldSimple>
       <w:r>
         <w:t>. Вкладка табличного представления данных</w:t>
       </w:r>
@@ -3202,6 +3186,9 @@
         <w:jc w:val="center"/>
       </w:pPr>
       <w:r>
+        <w:rPr>
+          <w:noProof/>
+        </w:rPr>
         <w:lastRenderedPageBreak/>
         <w:drawing>
           <wp:inline distT="0" distB="0" distL="0" distR="0" wp14:anchorId="60BBF088" wp14:editId="301C5CD4">
@@ -3247,24 +3234,14 @@
       <w:r>
         <w:t xml:space="preserve">Рис. </w:t>
       </w:r>
-      <w:r>
-        <w:fldChar w:fldCharType="begin"/>
-      </w:r>
-      <w:r>
-        <w:instrText xml:space="preserve"> SEQ Рис. \* ARABIC </w:instrText>
-      </w:r>
-      <w:r>
-        <w:fldChar w:fldCharType="separate"/>
-      </w:r>
-      <w:r>
-        <w:rPr>
-          <w:noProof/>
-        </w:rPr>
-        <w:t>8</w:t>
-      </w:r>
-      <w:r>
-        <w:fldChar w:fldCharType="end"/>
-      </w:r>
+      <w:fldSimple w:instr=" SEQ Рис. \* ARABIC ">
+        <w:r>
+          <w:rPr>
+            <w:noProof/>
+          </w:rPr>
+          <w:t>8</w:t>
+        </w:r>
+      </w:fldSimple>
       <w:r>
         <w:t>. Разделы для работы с запросами</w:t>
       </w:r>
@@ -3312,9 +3289,6 @@
     <w:p>
       <w:pPr>
         <w:pStyle w:val="a5"/>
-        <w:rPr>
-          <w:lang w:val="en-US"/>
-        </w:rPr>
       </w:pPr>
       <w:r>
         <w:t xml:space="preserve">Для создания таблицы используется следующая </w:t>
@@ -3335,9 +3309,6 @@
     <w:p>
       <w:pPr>
         <w:pStyle w:val="a5"/>
-        <w:rPr>
-          <w:lang w:val="en-US"/>
-        </w:rPr>
       </w:pPr>
     </w:p>
     <w:tbl>
@@ -3348,7 +3319,7 @@
         <w:tblLook w:val="04A0" w:firstRow="1" w:lastRow="0" w:firstColumn="1" w:lastColumn="0" w:noHBand="0" w:noVBand="1"/>
       </w:tblPr>
       <w:tblGrid>
-        <w:gridCol w:w="8625"/>
+        <w:gridCol w:w="8908"/>
       </w:tblGrid>
       <w:tr>
         <w:tc>
@@ -3363,7 +3334,6 @@
                 <w:rFonts w:ascii="Cascadia Mono" w:hAnsi="Cascadia Mono"/>
                 <w:sz w:val="20"/>
                 <w:szCs w:val="20"/>
-                <w:lang w:val="en-US"/>
               </w:rPr>
             </w:pPr>
             <w:r>
@@ -3401,7 +3371,6 @@
                 <w:rFonts w:ascii="Cascadia Mono" w:hAnsi="Cascadia Mono"/>
                 <w:sz w:val="20"/>
                 <w:szCs w:val="20"/>
-                <w:lang w:val="en-US"/>
               </w:rPr>
             </w:pPr>
             <w:r>
@@ -3409,18 +3378,8 @@
                 <w:rFonts w:ascii="Cascadia Mono" w:hAnsi="Cascadia Mono"/>
                 <w:sz w:val="20"/>
                 <w:szCs w:val="20"/>
-                <w:lang w:val="en-US"/>
-              </w:rPr>
-              <w:t xml:space="preserve">    </w:t>
-            </w:r>
-            <w:r>
-              <w:rPr>
-                <w:rFonts w:ascii="Cascadia Mono" w:hAnsi="Cascadia Mono"/>
-                <w:sz w:val="20"/>
-                <w:szCs w:val="20"/>
-                <w:lang w:val="en-US"/>
-              </w:rPr>
-              <w:t>&lt;</w:t>
+              </w:rPr>
+              <w:t xml:space="preserve">    &lt;</w:t>
             </w:r>
             <w:r>
               <w:rPr>
@@ -3435,7 +3394,6 @@
                 <w:rFonts w:ascii="Cascadia Mono" w:hAnsi="Cascadia Mono"/>
                 <w:sz w:val="20"/>
                 <w:szCs w:val="20"/>
-                <w:lang w:val="en-US"/>
               </w:rPr>
               <w:t>_</w:t>
             </w:r>
@@ -3452,10 +3410,10 @@
                 <w:rFonts w:ascii="Cascadia Mono" w:hAnsi="Cascadia Mono"/>
                 <w:sz w:val="20"/>
                 <w:szCs w:val="20"/>
-                <w:lang w:val="en-US"/>
               </w:rPr>
               <w:t>_1&gt; &lt;</w:t>
             </w:r>
+            <w:proofErr w:type="spellStart"/>
             <w:r>
               <w:rPr>
                 <w:rFonts w:ascii="Cascadia Mono" w:hAnsi="Cascadia Mono"/>
@@ -3469,7 +3427,6 @@
                 <w:rFonts w:ascii="Cascadia Mono" w:hAnsi="Cascadia Mono"/>
                 <w:sz w:val="20"/>
                 <w:szCs w:val="20"/>
-                <w:lang w:val="en-US"/>
               </w:rPr>
               <w:t>_</w:t>
             </w:r>
@@ -3481,14 +3438,65 @@
               </w:rPr>
               <w:t>данных</w:t>
             </w:r>
-            <w:r>
-              <w:rPr>
-                <w:rFonts w:ascii="Cascadia Mono" w:hAnsi="Cascadia Mono"/>
-                <w:sz w:val="20"/>
-                <w:szCs w:val="20"/>
-                <w:lang w:val="en-US"/>
-              </w:rPr>
-              <w:t xml:space="preserve">&gt; [NULL|NOT NULL], </w:t>
+            <w:proofErr w:type="spellEnd"/>
+            <w:r>
+              <w:rPr>
+                <w:rFonts w:ascii="Cascadia Mono" w:hAnsi="Cascadia Mono"/>
+                <w:sz w:val="20"/>
+                <w:szCs w:val="20"/>
+              </w:rPr>
+              <w:t>&gt; [</w:t>
+            </w:r>
+            <w:r>
+              <w:rPr>
+                <w:rFonts w:ascii="Cascadia Mono" w:hAnsi="Cascadia Mono"/>
+                <w:sz w:val="20"/>
+                <w:szCs w:val="20"/>
+                <w:lang w:val="en-US"/>
+              </w:rPr>
+              <w:t>NULL</w:t>
+            </w:r>
+            <w:r>
+              <w:rPr>
+                <w:rFonts w:ascii="Cascadia Mono" w:hAnsi="Cascadia Mono"/>
+                <w:sz w:val="20"/>
+                <w:szCs w:val="20"/>
+              </w:rPr>
+              <w:t>|</w:t>
+            </w:r>
+            <w:r>
+              <w:rPr>
+                <w:rFonts w:ascii="Cascadia Mono" w:hAnsi="Cascadia Mono"/>
+                <w:sz w:val="20"/>
+                <w:szCs w:val="20"/>
+                <w:lang w:val="en-US"/>
+              </w:rPr>
+              <w:t>NOT</w:t>
+            </w:r>
+            <w:r>
+              <w:rPr>
+                <w:rFonts w:ascii="Cascadia Mono" w:hAnsi="Cascadia Mono"/>
+                <w:sz w:val="20"/>
+                <w:szCs w:val="20"/>
+              </w:rPr>
+              <w:t xml:space="preserve"> </w:t>
+            </w:r>
+            <w:r>
+              <w:rPr>
+                <w:rFonts w:ascii="Cascadia Mono" w:hAnsi="Cascadia Mono"/>
+                <w:sz w:val="20"/>
+                <w:szCs w:val="20"/>
+                <w:lang w:val="en-US"/>
+              </w:rPr>
+              <w:t>NULL</w:t>
+            </w:r>
+            <w:r>
+              <w:rPr>
+                <w:rFonts w:ascii="Cascadia Mono" w:hAnsi="Cascadia Mono"/>
+                <w:sz w:val="20"/>
+                <w:szCs w:val="20"/>
+              </w:rPr>
+              <w:t xml:space="preserve">], </w:t>
             </w:r>
           </w:p>
           <w:p>
@@ -3499,7 +3507,6 @@
                 <w:rFonts w:ascii="Cascadia Mono" w:hAnsi="Cascadia Mono"/>
                 <w:sz w:val="20"/>
                 <w:szCs w:val="20"/>
-                <w:lang w:val="en-US"/>
               </w:rPr>
             </w:pPr>
             <w:r>
@@ -3507,18 +3514,8 @@
                 <w:rFonts w:ascii="Cascadia Mono" w:hAnsi="Cascadia Mono"/>
                 <w:sz w:val="20"/>
                 <w:szCs w:val="20"/>
-                <w:lang w:val="en-US"/>
-              </w:rPr>
-              <w:t xml:space="preserve">    </w:t>
-            </w:r>
-            <w:r>
-              <w:rPr>
-                <w:rFonts w:ascii="Cascadia Mono" w:hAnsi="Cascadia Mono"/>
-                <w:sz w:val="20"/>
-                <w:szCs w:val="20"/>
-                <w:lang w:val="en-US"/>
-              </w:rPr>
-              <w:t xml:space="preserve">..., </w:t>
+              </w:rPr>
+              <w:t xml:space="preserve">    ..., </w:t>
             </w:r>
           </w:p>
           <w:p>
@@ -3529,7 +3526,6 @@
                 <w:rFonts w:ascii="Cascadia Mono" w:hAnsi="Cascadia Mono"/>
                 <w:sz w:val="20"/>
                 <w:szCs w:val="20"/>
-                <w:lang w:val="en-US"/>
               </w:rPr>
             </w:pPr>
             <w:r>
@@ -3537,19 +3533,10 @@
                 <w:rFonts w:ascii="Cascadia Mono" w:hAnsi="Cascadia Mono"/>
                 <w:sz w:val="20"/>
                 <w:szCs w:val="20"/>
-                <w:lang w:val="en-US"/>
-              </w:rPr>
-              <w:t xml:space="preserve">    </w:t>
-            </w:r>
-            <w:r>
-              <w:rPr>
-                <w:rFonts w:ascii="Cascadia Mono" w:hAnsi="Cascadia Mono"/>
-                <w:sz w:val="20"/>
-                <w:szCs w:val="20"/>
-                <w:lang w:val="en-US"/>
-              </w:rPr>
-              <w:t>&lt;</w:t>
-            </w:r>
+              </w:rPr>
+              <w:t xml:space="preserve">    &lt;</w:t>
+            </w:r>
+            <w:proofErr w:type="spellStart"/>
             <w:r>
               <w:rPr>
                 <w:rFonts w:ascii="Cascadia Mono" w:hAnsi="Cascadia Mono"/>
@@ -3563,7 +3550,6 @@
                 <w:rFonts w:ascii="Cascadia Mono" w:hAnsi="Cascadia Mono"/>
                 <w:sz w:val="20"/>
                 <w:szCs w:val="20"/>
-                <w:lang w:val="en-US"/>
               </w:rPr>
               <w:t>_</w:t>
             </w:r>
@@ -3575,15 +3561,33 @@
               </w:rPr>
               <w:t>поля</w:t>
             </w:r>
-            <w:r>
-              <w:rPr>
-                <w:rFonts w:ascii="Cascadia Mono" w:hAnsi="Cascadia Mono"/>
-                <w:sz w:val="20"/>
-                <w:szCs w:val="20"/>
-                <w:lang w:val="en-US"/>
-              </w:rPr>
-              <w:t>_n&gt; &lt;</w:t>
-            </w:r>
+            <w:proofErr w:type="spellEnd"/>
+            <w:r>
+              <w:rPr>
+                <w:rFonts w:ascii="Cascadia Mono" w:hAnsi="Cascadia Mono"/>
+                <w:sz w:val="20"/>
+                <w:szCs w:val="20"/>
+              </w:rPr>
+              <w:t>_</w:t>
+            </w:r>
+            <w:r>
+              <w:rPr>
+                <w:rFonts w:ascii="Cascadia Mono" w:hAnsi="Cascadia Mono"/>
+                <w:sz w:val="20"/>
+                <w:szCs w:val="20"/>
+                <w:lang w:val="en-US"/>
+              </w:rPr>
+              <w:t>n</w:t>
+            </w:r>
+            <w:r>
+              <w:rPr>
+                <w:rFonts w:ascii="Cascadia Mono" w:hAnsi="Cascadia Mono"/>
+                <w:sz w:val="20"/>
+                <w:szCs w:val="20"/>
+              </w:rPr>
+              <w:t>&gt; &lt;</w:t>
+            </w:r>
+            <w:proofErr w:type="spellStart"/>
             <w:r>
               <w:rPr>
                 <w:rFonts w:ascii="Cascadia Mono" w:hAnsi="Cascadia Mono"/>
@@ -3597,7 +3601,6 @@
                 <w:rFonts w:ascii="Cascadia Mono" w:hAnsi="Cascadia Mono"/>
                 <w:sz w:val="20"/>
                 <w:szCs w:val="20"/>
-                <w:lang w:val="en-US"/>
               </w:rPr>
               <w:t>_</w:t>
             </w:r>
@@ -3609,14 +3612,65 @@
               </w:rPr>
               <w:t>данных</w:t>
             </w:r>
-            <w:r>
-              <w:rPr>
-                <w:rFonts w:ascii="Cascadia Mono" w:hAnsi="Cascadia Mono"/>
-                <w:sz w:val="20"/>
-                <w:szCs w:val="20"/>
-                <w:lang w:val="en-US"/>
-              </w:rPr>
-              <w:t>&gt; [NULL|NOT NULL]</w:t>
+            <w:proofErr w:type="spellEnd"/>
+            <w:r>
+              <w:rPr>
+                <w:rFonts w:ascii="Cascadia Mono" w:hAnsi="Cascadia Mono"/>
+                <w:sz w:val="20"/>
+                <w:szCs w:val="20"/>
+              </w:rPr>
+              <w:t>&gt; [</w:t>
+            </w:r>
+            <w:r>
+              <w:rPr>
+                <w:rFonts w:ascii="Cascadia Mono" w:hAnsi="Cascadia Mono"/>
+                <w:sz w:val="20"/>
+                <w:szCs w:val="20"/>
+                <w:lang w:val="en-US"/>
+              </w:rPr>
+              <w:t>NULL</w:t>
+            </w:r>
+            <w:r>
+              <w:rPr>
+                <w:rFonts w:ascii="Cascadia Mono" w:hAnsi="Cascadia Mono"/>
+                <w:sz w:val="20"/>
+                <w:szCs w:val="20"/>
+              </w:rPr>
+              <w:t>|</w:t>
+            </w:r>
+            <w:r>
+              <w:rPr>
+                <w:rFonts w:ascii="Cascadia Mono" w:hAnsi="Cascadia Mono"/>
+                <w:sz w:val="20"/>
+                <w:szCs w:val="20"/>
+                <w:lang w:val="en-US"/>
+              </w:rPr>
+              <w:t>NOT</w:t>
+            </w:r>
+            <w:r>
+              <w:rPr>
+                <w:rFonts w:ascii="Cascadia Mono" w:hAnsi="Cascadia Mono"/>
+                <w:sz w:val="20"/>
+                <w:szCs w:val="20"/>
+              </w:rPr>
+              <w:t xml:space="preserve"> </w:t>
+            </w:r>
+            <w:r>
+              <w:rPr>
+                <w:rFonts w:ascii="Cascadia Mono" w:hAnsi="Cascadia Mono"/>
+                <w:sz w:val="20"/>
+                <w:szCs w:val="20"/>
+                <w:lang w:val="en-US"/>
+              </w:rPr>
+              <w:t>NULL</w:t>
+            </w:r>
+            <w:r>
+              <w:rPr>
+                <w:rFonts w:ascii="Cascadia Mono" w:hAnsi="Cascadia Mono"/>
+                <w:sz w:val="20"/>
+                <w:szCs w:val="20"/>
+              </w:rPr>
+              <w:t>]</w:t>
             </w:r>
           </w:p>
           <w:p>
@@ -3653,9 +3707,6 @@
     <w:p>
       <w:pPr>
         <w:pStyle w:val="a5"/>
-        <w:rPr>
-          <w:lang w:val="en-US"/>
-        </w:rPr>
       </w:pPr>
       <w:r>
         <w:t xml:space="preserve">В редакторе </w:t>
@@ -3676,9 +3727,6 @@
     <w:p>
       <w:pPr>
         <w:pStyle w:val="a5"/>
-        <w:rPr>
-          <w:lang w:val="en-US"/>
-        </w:rPr>
       </w:pPr>
     </w:p>
     <w:tbl>
@@ -3689,7 +3737,7 @@
         <w:tblLook w:val="04A0" w:firstRow="1" w:lastRow="0" w:firstColumn="1" w:lastColumn="0" w:noHBand="0" w:noVBand="1"/>
       </w:tblPr>
       <w:tblGrid>
-        <w:gridCol w:w="8625"/>
+        <w:gridCol w:w="8908"/>
       </w:tblGrid>
       <w:tr>
         <w:tc>
@@ -3959,11 +4007,11 @@
         <w:t xml:space="preserve"> </w:t>
       </w:r>
       <w:r>
-        <w:t xml:space="preserve">для записи изменений в базу. </w:t>
+        <w:t xml:space="preserve">для записи изменений в базу. Результатом </w:t>
       </w:r>
       <w:r>
         <w:lastRenderedPageBreak/>
-        <w:t xml:space="preserve">Результатом выполнения </w:t>
+        <w:t xml:space="preserve">выполнения </w:t>
       </w:r>
       <w:r>
         <w:rPr>
@@ -4135,24 +4183,14 @@
       <w:r>
         <w:t xml:space="preserve">Рис. </w:t>
       </w:r>
-      <w:r>
-        <w:fldChar w:fldCharType="begin"/>
-      </w:r>
-      <w:r>
-        <w:instrText xml:space="preserve"> SEQ Рис. \* ARABIC </w:instrText>
-      </w:r>
-      <w:r>
-        <w:fldChar w:fldCharType="separate"/>
-      </w:r>
-      <w:r>
-        <w:rPr>
-          <w:noProof/>
-        </w:rPr>
-        <w:t>9</w:t>
-      </w:r>
-      <w:r>
-        <w:fldChar w:fldCharType="end"/>
-      </w:r>
+      <w:fldSimple w:instr=" SEQ Рис. \* ARABIC ">
+        <w:r>
+          <w:rPr>
+            <w:noProof/>
+          </w:rPr>
+          <w:t>9</w:t>
+        </w:r>
+      </w:fldSimple>
       <w:r>
         <w:t>. Структура таблицы</w:t>
       </w:r>
@@ -4179,9 +4217,6 @@
     <w:p>
       <w:pPr>
         <w:pStyle w:val="a5"/>
-        <w:rPr>
-          <w:lang w:val="en-US"/>
-        </w:rPr>
       </w:pPr>
     </w:p>
     <w:p>
@@ -4211,7 +4246,7 @@
         <w:tblLook w:val="04A0" w:firstRow="1" w:lastRow="0" w:firstColumn="1" w:lastColumn="0" w:noHBand="0" w:noVBand="1"/>
       </w:tblPr>
       <w:tblGrid>
-        <w:gridCol w:w="8625"/>
+        <w:gridCol w:w="8908"/>
       </w:tblGrid>
       <w:tr>
         <w:tc>
@@ -4320,7 +4355,7 @@
         <w:tblLook w:val="04A0" w:firstRow="1" w:lastRow="0" w:firstColumn="1" w:lastColumn="0" w:noHBand="0" w:noVBand="1"/>
       </w:tblPr>
       <w:tblGrid>
-        <w:gridCol w:w="8625"/>
+        <w:gridCol w:w="8908"/>
       </w:tblGrid>
       <w:tr>
         <w:tc>
@@ -5247,19 +5282,7 @@
         <w:pStyle w:val="a5"/>
       </w:pPr>
       <w:r>
-        <w:t xml:space="preserve">Результат выполнения запроса </w:t>
-      </w:r>
-      <w:r>
-        <w:t>в виде нов</w:t>
-      </w:r>
-      <w:r>
-        <w:t>ых</w:t>
-      </w:r>
-      <w:r>
-        <w:t xml:space="preserve"> запис</w:t>
-      </w:r>
-      <w:r>
-        <w:t xml:space="preserve">ей можно обнаружить во вкладке </w:t>
+        <w:t xml:space="preserve">Результат выполнения запроса в виде новых записей можно обнаружить во вкладке </w:t>
       </w:r>
       <w:r>
         <w:rPr>
@@ -5336,24 +5359,14 @@
       <w:r>
         <w:t xml:space="preserve">Рис. </w:t>
       </w:r>
-      <w:r>
-        <w:fldChar w:fldCharType="begin"/>
-      </w:r>
-      <w:r>
-        <w:instrText xml:space="preserve"> SEQ Рис. \* ARABIC </w:instrText>
-      </w:r>
-      <w:r>
-        <w:fldChar w:fldCharType="separate"/>
-      </w:r>
-      <w:r>
-        <w:rPr>
-          <w:noProof/>
-        </w:rPr>
-        <w:t>10</w:t>
-      </w:r>
-      <w:r>
-        <w:fldChar w:fldCharType="end"/>
-      </w:r>
+      <w:fldSimple w:instr=" SEQ Рис. \* ARABIC ">
+        <w:r>
+          <w:rPr>
+            <w:noProof/>
+          </w:rPr>
+          <w:t>10</w:t>
+        </w:r>
+      </w:fldSimple>
       <w:r>
         <w:t xml:space="preserve">. Добавленные в таблицу записи </w:t>
       </w:r>
@@ -5396,7 +5409,7 @@
         <w:tblLook w:val="04A0" w:firstRow="1" w:lastRow="0" w:firstColumn="1" w:lastColumn="0" w:noHBand="0" w:noVBand="1"/>
       </w:tblPr>
       <w:tblGrid>
-        <w:gridCol w:w="8625"/>
+        <w:gridCol w:w="8908"/>
       </w:tblGrid>
       <w:tr>
         <w:tc>
@@ -5571,7 +5584,7 @@
         <w:tblLook w:val="04A0" w:firstRow="1" w:lastRow="0" w:firstColumn="1" w:lastColumn="0" w:noHBand="0" w:noVBand="1"/>
       </w:tblPr>
       <w:tblGrid>
-        <w:gridCol w:w="8625"/>
+        <w:gridCol w:w="8908"/>
       </w:tblGrid>
       <w:tr>
         <w:tc>
@@ -5620,6 +5633,9 @@
     <w:p>
       <w:pPr>
         <w:pStyle w:val="a5"/>
+        <w:rPr>
+          <w:lang w:val="en-US"/>
+        </w:rPr>
       </w:pPr>
     </w:p>
     <w:p>
@@ -5710,24 +5726,14 @@
       <w:r>
         <w:t xml:space="preserve">Рис. </w:t>
       </w:r>
-      <w:r>
-        <w:fldChar w:fldCharType="begin"/>
-      </w:r>
-      <w:r>
-        <w:instrText xml:space="preserve"> SEQ Рис. \* ARABIC </w:instrText>
-      </w:r>
-      <w:r>
-        <w:fldChar w:fldCharType="separate"/>
-      </w:r>
-      <w:r>
-        <w:rPr>
-          <w:noProof/>
-        </w:rPr>
-        <w:t>11</w:t>
-      </w:r>
-      <w:r>
-        <w:fldChar w:fldCharType="end"/>
-      </w:r>
+      <w:fldSimple w:instr=" SEQ Рис. \* ARABIC ">
+        <w:r>
+          <w:rPr>
+            <w:noProof/>
+          </w:rPr>
+          <w:t>11</w:t>
+        </w:r>
+      </w:fldSimple>
       <w:r>
         <w:t>. Новое поле в описании структуры</w:t>
       </w:r>
@@ -5802,7 +5808,7 @@
         <w:tblLook w:val="04A0" w:firstRow="1" w:lastRow="0" w:firstColumn="1" w:lastColumn="0" w:noHBand="0" w:noVBand="1"/>
       </w:tblPr>
       <w:tblGrid>
-        <w:gridCol w:w="8625"/>
+        <w:gridCol w:w="8908"/>
       </w:tblGrid>
       <w:tr>
         <w:tc>
@@ -5862,7 +5868,6 @@
                 <w:sz w:val="20"/>
                 <w:szCs w:val="20"/>
               </w:rPr>
-              <w:lastRenderedPageBreak/>
               <w:t xml:space="preserve">    </w:t>
             </w:r>
             <w:r>
@@ -5926,6 +5931,7 @@
                 <w:sz w:val="20"/>
                 <w:szCs w:val="20"/>
               </w:rPr>
+              <w:lastRenderedPageBreak/>
               <w:t xml:space="preserve">    </w:t>
             </w:r>
             <w:r>
@@ -6061,7 +6067,7 @@
         <w:tblLook w:val="04A0" w:firstRow="1" w:lastRow="0" w:firstColumn="1" w:lastColumn="0" w:noHBand="0" w:noVBand="1"/>
       </w:tblPr>
       <w:tblGrid>
-        <w:gridCol w:w="7905"/>
+        <w:gridCol w:w="8188"/>
       </w:tblGrid>
       <w:tr>
         <w:tc>
@@ -6234,7 +6240,6 @@
                 <w:rFonts w:ascii="Cascadia Mono" w:hAnsi="Cascadia Mono"/>
                 <w:sz w:val="20"/>
                 <w:szCs w:val="20"/>
-                <w:lang w:val="en-US"/>
               </w:rPr>
             </w:pPr>
             <w:r>
@@ -6244,7 +6249,15 @@
                 <w:szCs w:val="20"/>
                 <w:lang w:val="en-US"/>
               </w:rPr>
-              <w:t xml:space="preserve">    SET </w:t>
+              <w:t xml:space="preserve">    SET</w:t>
+            </w:r>
+            <w:r>
+              <w:rPr>
+                <w:rFonts w:ascii="Cascadia Mono" w:hAnsi="Cascadia Mono"/>
+                <w:sz w:val="20"/>
+                <w:szCs w:val="20"/>
+              </w:rPr>
+              <w:t xml:space="preserve"> </w:t>
             </w:r>
             <w:r>
               <w:rPr>
@@ -6259,7 +6272,6 @@
                 <w:rFonts w:ascii="Cascadia Mono" w:hAnsi="Cascadia Mono"/>
                 <w:sz w:val="20"/>
                 <w:szCs w:val="20"/>
-                <w:lang w:val="en-US"/>
               </w:rPr>
               <w:t>='</w:t>
             </w:r>
@@ -6276,7 +6288,6 @@
                 <w:rFonts w:ascii="Cascadia Mono" w:hAnsi="Cascadia Mono"/>
                 <w:sz w:val="20"/>
                 <w:szCs w:val="20"/>
-                <w:lang w:val="en-US"/>
               </w:rPr>
               <w:t>'</w:t>
             </w:r>
@@ -6288,7 +6299,6 @@
                 <w:rFonts w:ascii="Cascadia Mono" w:hAnsi="Cascadia Mono"/>
                 <w:sz w:val="20"/>
                 <w:szCs w:val="20"/>
-                <w:lang w:val="en-US"/>
               </w:rPr>
             </w:pPr>
             <w:r>
@@ -6296,9 +6306,25 @@
                 <w:rFonts w:ascii="Cascadia Mono" w:hAnsi="Cascadia Mono"/>
                 <w:sz w:val="20"/>
                 <w:szCs w:val="20"/>
-                <w:lang w:val="en-US"/>
-              </w:rPr>
-              <w:t xml:space="preserve">    WHERE </w:t>
+              </w:rPr>
+              <w:t xml:space="preserve">    </w:t>
+            </w:r>
+            <w:r>
+              <w:rPr>
+                <w:rFonts w:ascii="Cascadia Mono" w:hAnsi="Cascadia Mono"/>
+                <w:sz w:val="20"/>
+                <w:szCs w:val="20"/>
+                <w:lang w:val="en-US"/>
+              </w:rPr>
+              <w:t>WHERE</w:t>
+            </w:r>
+            <w:r>
+              <w:rPr>
+                <w:rFonts w:ascii="Cascadia Mono" w:hAnsi="Cascadia Mono"/>
+                <w:sz w:val="20"/>
+                <w:szCs w:val="20"/>
+              </w:rPr>
+              <w:t xml:space="preserve"> </w:t>
             </w:r>
             <w:r>
               <w:rPr>
@@ -6313,7 +6339,6 @@
                 <w:rFonts w:ascii="Cascadia Mono" w:hAnsi="Cascadia Mono"/>
                 <w:sz w:val="20"/>
                 <w:szCs w:val="20"/>
-                <w:lang w:val="en-US"/>
               </w:rPr>
               <w:t>='</w:t>
             </w:r>
@@ -6330,7 +6355,6 @@
                 <w:rFonts w:ascii="Cascadia Mono" w:hAnsi="Cascadia Mono"/>
                 <w:sz w:val="20"/>
                 <w:szCs w:val="20"/>
-                <w:lang w:val="en-US"/>
               </w:rPr>
               <w:t>'</w:t>
             </w:r>
@@ -6766,7 +6790,7 @@
         <w:tblLook w:val="04A0" w:firstRow="1" w:lastRow="0" w:firstColumn="1" w:lastColumn="0" w:noHBand="0" w:noVBand="1"/>
       </w:tblPr>
       <w:tblGrid>
-        <w:gridCol w:w="7905"/>
+        <w:gridCol w:w="8188"/>
       </w:tblGrid>
       <w:tr>
         <w:tc>
@@ -7094,24 +7118,14 @@
       <w:r>
         <w:t xml:space="preserve">Рис. </w:t>
       </w:r>
-      <w:r>
-        <w:fldChar w:fldCharType="begin"/>
-      </w:r>
-      <w:r>
-        <w:instrText xml:space="preserve"> SEQ Рис. \* ARABIC </w:instrText>
-      </w:r>
-      <w:r>
-        <w:fldChar w:fldCharType="separate"/>
-      </w:r>
-      <w:r>
-        <w:rPr>
-          <w:noProof/>
-        </w:rPr>
-        <w:t>12</w:t>
-      </w:r>
-      <w:r>
-        <w:fldChar w:fldCharType="end"/>
-      </w:r>
+      <w:fldSimple w:instr=" SEQ Рис. \* ARABIC ">
+        <w:r>
+          <w:rPr>
+            <w:noProof/>
+          </w:rPr>
+          <w:t>12</w:t>
+        </w:r>
+      </w:fldSimple>
       <w:r>
         <w:t>. Таблица с заполненным полем «Пол»</w:t>
       </w:r>
@@ -7193,7 +7207,7 @@
         <w:tblLook w:val="04A0" w:firstRow="1" w:lastRow="0" w:firstColumn="1" w:lastColumn="0" w:noHBand="0" w:noVBand="1"/>
       </w:tblPr>
       <w:tblGrid>
-        <w:gridCol w:w="7905"/>
+        <w:gridCol w:w="8188"/>
       </w:tblGrid>
       <w:tr>
         <w:tc>
@@ -7318,7 +7332,7 @@
         <w:tblLook w:val="04A0" w:firstRow="1" w:lastRow="0" w:firstColumn="1" w:lastColumn="0" w:noHBand="0" w:noVBand="1"/>
       </w:tblPr>
       <w:tblGrid>
-        <w:gridCol w:w="7905"/>
+        <w:gridCol w:w="8188"/>
       </w:tblGrid>
       <w:tr>
         <w:tc>
@@ -7434,7 +7448,7 @@
         <w:tblLook w:val="04A0" w:firstRow="1" w:lastRow="0" w:firstColumn="1" w:lastColumn="0" w:noHBand="0" w:noVBand="1"/>
       </w:tblPr>
       <w:tblGrid>
-        <w:gridCol w:w="7905"/>
+        <w:gridCol w:w="8188"/>
       </w:tblGrid>
       <w:tr>
         <w:tc>
@@ -7508,6 +7522,9 @@
     <w:p>
       <w:pPr>
         <w:pStyle w:val="a5"/>
+        <w:rPr>
+          <w:lang w:val="en-US"/>
+        </w:rPr>
       </w:pPr>
     </w:p>
     <w:p>
@@ -7597,7 +7614,7 @@
         <w:tblLook w:val="04A0" w:firstRow="1" w:lastRow="0" w:firstColumn="1" w:lastColumn="0" w:noHBand="0" w:noVBand="1"/>
       </w:tblPr>
       <w:tblGrid>
-        <w:gridCol w:w="8625"/>
+        <w:gridCol w:w="8908"/>
       </w:tblGrid>
       <w:tr>
         <w:tc>
@@ -8607,15 +8624,7 @@
                 <w:sz w:val="20"/>
                 <w:szCs w:val="20"/>
               </w:rPr>
-              <w:t>4</w:t>
-            </w:r>
-            <w:r>
-              <w:rPr>
-                <w:rFonts w:ascii="Cascadia Mono" w:hAnsi="Cascadia Mono"/>
-                <w:sz w:val="20"/>
-                <w:szCs w:val="20"/>
-              </w:rPr>
-              <w:t xml:space="preserve">, </w:t>
+              <w:t xml:space="preserve">4, </w:t>
             </w:r>
             <w:r>
               <w:rPr>
@@ -8940,6 +8949,7 @@
       </w:pPr>
       <w:r>
         <w:rPr>
+          <w:noProof/>
           <w:szCs w:val="28"/>
         </w:rPr>
         <w:lastRenderedPageBreak/>
@@ -8990,24 +9000,14 @@
       <w:r>
         <w:t xml:space="preserve">Рис. </w:t>
       </w:r>
-      <w:r>
-        <w:fldChar w:fldCharType="begin"/>
-      </w:r>
-      <w:r>
-        <w:instrText xml:space="preserve"> SEQ Рис. \* ARABIC </w:instrText>
-      </w:r>
-      <w:r>
-        <w:fldChar w:fldCharType="separate"/>
-      </w:r>
-      <w:r>
-        <w:rPr>
-          <w:noProof/>
-        </w:rPr>
-        <w:t>13</w:t>
-      </w:r>
-      <w:r>
-        <w:fldChar w:fldCharType="end"/>
-      </w:r>
+      <w:fldSimple w:instr=" SEQ Рис. \* ARABIC ">
+        <w:r>
+          <w:rPr>
+            <w:noProof/>
+          </w:rPr>
+          <w:t>13</w:t>
+        </w:r>
+      </w:fldSimple>
       <w:r>
         <w:t>. Таблица студентов из параллельной группы</w:t>
       </w:r>
@@ -9071,7 +9071,7 @@
         <w:tblLook w:val="04A0" w:firstRow="1" w:lastRow="0" w:firstColumn="1" w:lastColumn="0" w:noHBand="0" w:noVBand="1"/>
       </w:tblPr>
       <w:tblGrid>
-        <w:gridCol w:w="8625"/>
+        <w:gridCol w:w="8908"/>
       </w:tblGrid>
       <w:tr>
         <w:tc>
@@ -9096,16 +9096,7 @@
                 <w:szCs w:val="20"/>
                 <w:lang w:val="en-US"/>
               </w:rPr>
-              <w:t xml:space="preserve">SELECT * FROM </w:t>
-            </w:r>
-            <w:r>
-              <w:rPr>
-                <w:rFonts w:ascii="Cascadia Mono" w:hAnsi="Cascadia Mono"/>
-                <w:sz w:val="20"/>
-                <w:szCs w:val="20"/>
-                <w:lang w:val="en-US"/>
-              </w:rPr>
-              <w:t>&lt;</w:t>
+              <w:t>SELECT * FROM &lt;</w:t>
             </w:r>
             <w:r>
               <w:rPr>
@@ -9139,16 +9130,7 @@
                 <w:szCs w:val="20"/>
                 <w:lang w:val="en-US"/>
               </w:rPr>
-              <w:t>&gt;</w:t>
-            </w:r>
-            <w:r>
-              <w:rPr>
-                <w:rFonts w:ascii="Cascadia Mono" w:hAnsi="Cascadia Mono"/>
-                <w:sz w:val="20"/>
-                <w:szCs w:val="20"/>
-                <w:lang w:val="en-US"/>
-              </w:rPr>
-              <w:t xml:space="preserve"> ORDER BY </w:t>
+              <w:t xml:space="preserve">&gt; ORDER BY </w:t>
             </w:r>
             <w:r>
               <w:rPr>
@@ -9185,7 +9167,6 @@
         <w:pStyle w:val="a5"/>
         <w:rPr>
           <w:szCs w:val="28"/>
-          <w:lang w:val="en-US"/>
         </w:rPr>
       </w:pPr>
       <w:r>
@@ -9243,33 +9224,14 @@
         <w:rPr>
           <w:szCs w:val="28"/>
         </w:rPr>
-        <w:t>SC</w:t>
-      </w:r>
-      <w:r>
+        <w:t>SC/DESC.</w:t>
+      </w:r>
+    </w:p>
+    <w:p>
+      <w:pPr>
+        <w:pStyle w:val="a5"/>
         <w:rPr>
           <w:szCs w:val="28"/>
-        </w:rPr>
-        <w:t>/</w:t>
-      </w:r>
-      <w:r>
-        <w:rPr>
-          <w:szCs w:val="28"/>
-        </w:rPr>
-        <w:t>DESC</w:t>
-      </w:r>
-      <w:r>
-        <w:rPr>
-          <w:szCs w:val="28"/>
-        </w:rPr>
-        <w:t>.</w:t>
-      </w:r>
-    </w:p>
-    <w:p>
-      <w:pPr>
-        <w:pStyle w:val="a5"/>
-        <w:rPr>
-          <w:szCs w:val="28"/>
-          <w:lang w:val="en-US"/>
         </w:rPr>
       </w:pPr>
     </w:p>
@@ -9303,7 +9265,7 @@
         <w:tblLook w:val="04A0" w:firstRow="1" w:lastRow="0" w:firstColumn="1" w:lastColumn="0" w:noHBand="0" w:noVBand="1"/>
       </w:tblPr>
       <w:tblGrid>
-        <w:gridCol w:w="8625"/>
+        <w:gridCol w:w="8908"/>
       </w:tblGrid>
       <w:tr>
         <w:tc>
@@ -9358,6 +9320,7 @@
         <w:ind w:firstLine="0"/>
         <w:rPr>
           <w:szCs w:val="28"/>
+          <w:lang w:val="en-US"/>
         </w:rPr>
       </w:pPr>
     </w:p>
@@ -9474,24 +9437,14 @@
       <w:r>
         <w:t xml:space="preserve">Рис. </w:t>
       </w:r>
-      <w:r>
-        <w:fldChar w:fldCharType="begin"/>
-      </w:r>
-      <w:r>
-        <w:instrText xml:space="preserve"> SEQ Рис. \* ARABIC </w:instrText>
-      </w:r>
-      <w:r>
-        <w:fldChar w:fldCharType="separate"/>
-      </w:r>
-      <w:r>
-        <w:rPr>
-          <w:noProof/>
-        </w:rPr>
-        <w:t>14</w:t>
-      </w:r>
-      <w:r>
-        <w:fldChar w:fldCharType="end"/>
-      </w:r>
+      <w:fldSimple w:instr=" SEQ Рис. \* ARABIC ">
+        <w:r>
+          <w:rPr>
+            <w:noProof/>
+          </w:rPr>
+          <w:t>14</w:t>
+        </w:r>
+      </w:fldSimple>
       <w:r>
         <w:t>. Результирующая отсортированная таблица</w:t>
       </w:r>
@@ -9697,7 +9650,7 @@
         <w:tblLook w:val="04A0" w:firstRow="1" w:lastRow="0" w:firstColumn="1" w:lastColumn="0" w:noHBand="0" w:noVBand="1"/>
       </w:tblPr>
       <w:tblGrid>
-        <w:gridCol w:w="8625"/>
+        <w:gridCol w:w="8908"/>
       </w:tblGrid>
       <w:tr>
         <w:tc>
@@ -9990,7 +9943,7 @@
         <w:tblLook w:val="04A0" w:firstRow="1" w:lastRow="0" w:firstColumn="1" w:lastColumn="0" w:noHBand="0" w:noVBand="1"/>
       </w:tblPr>
       <w:tblGrid>
-        <w:gridCol w:w="8625"/>
+        <w:gridCol w:w="8908"/>
       </w:tblGrid>
       <w:tr>
         <w:tc>
@@ -10225,24 +10178,14 @@
       <w:r>
         <w:t xml:space="preserve">Рис. </w:t>
       </w:r>
-      <w:r>
-        <w:fldChar w:fldCharType="begin"/>
-      </w:r>
-      <w:r>
-        <w:instrText xml:space="preserve"> SEQ Рис. \* ARABIC </w:instrText>
-      </w:r>
-      <w:r>
-        <w:fldChar w:fldCharType="separate"/>
-      </w:r>
-      <w:r>
-        <w:rPr>
-          <w:noProof/>
-        </w:rPr>
-        <w:t>15</w:t>
-      </w:r>
-      <w:r>
-        <w:fldChar w:fldCharType="end"/>
-      </w:r>
+      <w:fldSimple w:instr=" SEQ Рис. \* ARABIC ">
+        <w:r>
+          <w:rPr>
+            <w:noProof/>
+          </w:rPr>
+          <w:t>15</w:t>
+        </w:r>
+      </w:fldSimple>
       <w:r>
         <w:t>. Таблица с фамилиями и датами рождения студентов</w:t>
       </w:r>
@@ -10250,17 +10193,11 @@
     <w:p>
       <w:pPr>
         <w:pStyle w:val="a5"/>
-        <w:rPr>
-          <w:lang w:val="en-US"/>
-        </w:rPr>
       </w:pPr>
       <w:r>
         <w:t>б). Для выбора студентов отличников по математике нужно проверить равняется ли значение их оценки в поле «Математика» 5. Для этого используется сегмент условия оператора выбора. Условие записывается как</w:t>
       </w:r>
       <w:r>
-        <w:rPr>
-          <w:lang w:val="en-US"/>
-        </w:rPr>
         <w:t>:</w:t>
       </w:r>
     </w:p>
@@ -10279,7 +10216,6 @@
           <w:rFonts w:ascii="Cascadia Mono" w:hAnsi="Cascadia Mono"/>
           <w:sz w:val="20"/>
           <w:szCs w:val="20"/>
-          <w:lang w:val="en-US"/>
         </w:rPr>
         <w:t>&lt;</w:t>
       </w:r>
@@ -10296,7 +10232,6 @@
           <w:rFonts w:ascii="Cascadia Mono" w:hAnsi="Cascadia Mono"/>
           <w:sz w:val="20"/>
           <w:szCs w:val="20"/>
-          <w:lang w:val="en-US"/>
         </w:rPr>
         <w:t>&gt;</w:t>
       </w:r>
@@ -10308,29 +10243,55 @@
         </w:rPr>
         <w:t xml:space="preserve"> =</w:t>
       </w:r>
+      <w:proofErr w:type="gramStart"/>
       <w:r>
         <w:rPr>
           <w:rFonts w:ascii="Cascadia Mono" w:hAnsi="Cascadia Mono"/>
           <w:sz w:val="20"/>
           <w:szCs w:val="20"/>
-          <w:lang w:val="en-US"/>
-        </w:rPr>
-        <w:t>|&lt;=|=&gt;|&lt;&gt; &lt;</w:t>
-      </w:r>
+        </w:rPr>
+        <w:t>|&lt;</w:t>
+      </w:r>
+      <w:proofErr w:type="gramEnd"/>
       <w:r>
         <w:rPr>
           <w:rFonts w:ascii="Cascadia Mono" w:hAnsi="Cascadia Mono"/>
           <w:sz w:val="20"/>
           <w:szCs w:val="20"/>
         </w:rPr>
-        <w:t>значение</w:t>
-      </w:r>
+        <w:t>=|</w:t>
+      </w:r>
+      <w:proofErr w:type="gramStart"/>
       <w:r>
         <w:rPr>
           <w:rFonts w:ascii="Cascadia Mono" w:hAnsi="Cascadia Mono"/>
           <w:sz w:val="20"/>
           <w:szCs w:val="20"/>
-          <w:lang w:val="en-US"/>
+        </w:rPr>
+        <w:t>=&gt;|</w:t>
+      </w:r>
+      <w:proofErr w:type="gramEnd"/>
+      <w:r>
+        <w:rPr>
+          <w:rFonts w:ascii="Cascadia Mono" w:hAnsi="Cascadia Mono"/>
+          <w:sz w:val="20"/>
+          <w:szCs w:val="20"/>
+        </w:rPr>
+        <w:t>&lt;&gt; &lt;</w:t>
+      </w:r>
+      <w:r>
+        <w:rPr>
+          <w:rFonts w:ascii="Cascadia Mono" w:hAnsi="Cascadia Mono"/>
+          <w:sz w:val="20"/>
+          <w:szCs w:val="20"/>
+        </w:rPr>
+        <w:t>значение</w:t>
+      </w:r>
+      <w:r>
+        <w:rPr>
+          <w:rFonts w:ascii="Cascadia Mono" w:hAnsi="Cascadia Mono"/>
+          <w:sz w:val="20"/>
+          <w:szCs w:val="20"/>
         </w:rPr>
         <w:t>&gt;</w:t>
       </w:r>
@@ -10357,7 +10318,7 @@
         <w:tblLook w:val="04A0" w:firstRow="1" w:lastRow="0" w:firstColumn="1" w:lastColumn="0" w:noHBand="0" w:noVBand="1"/>
       </w:tblPr>
       <w:tblGrid>
-        <w:gridCol w:w="8625"/>
+        <w:gridCol w:w="8908"/>
       </w:tblGrid>
       <w:tr>
         <w:tc>
@@ -10571,24 +10532,14 @@
       <w:r>
         <w:t xml:space="preserve">Рис. </w:t>
       </w:r>
-      <w:r>
-        <w:fldChar w:fldCharType="begin"/>
-      </w:r>
-      <w:r>
-        <w:instrText xml:space="preserve"> SEQ Рис. \* ARABIC </w:instrText>
-      </w:r>
-      <w:r>
-        <w:fldChar w:fldCharType="separate"/>
-      </w:r>
-      <w:r>
-        <w:rPr>
-          <w:noProof/>
-        </w:rPr>
-        <w:t>16</w:t>
-      </w:r>
-      <w:r>
-        <w:fldChar w:fldCharType="end"/>
-      </w:r>
+      <w:fldSimple w:instr=" SEQ Рис. \* ARABIC ">
+        <w:r>
+          <w:rPr>
+            <w:noProof/>
+          </w:rPr>
+          <w:t>16</w:t>
+        </w:r>
+      </w:fldSimple>
       <w:r>
         <w:t>. Таблица с отличниками по математике</w:t>
       </w:r>
@@ -10653,7 +10604,7 @@
         <w:tblLook w:val="04A0" w:firstRow="1" w:lastRow="0" w:firstColumn="1" w:lastColumn="0" w:noHBand="0" w:noVBand="1"/>
       </w:tblPr>
       <w:tblGrid>
-        <w:gridCol w:w="8625"/>
+        <w:gridCol w:w="8908"/>
       </w:tblGrid>
       <w:tr>
         <w:tc>
@@ -10812,7 +10763,13 @@
         </w:tc>
       </w:tr>
     </w:tbl>
-    <w:p/>
+    <w:p>
+      <w:pPr>
+        <w:rPr>
+          <w:lang w:val="en-US"/>
+        </w:rPr>
+      </w:pPr>
+    </w:p>
     <w:p>
       <w:pPr>
         <w:pStyle w:val="a5"/>
@@ -10881,24 +10838,14 @@
       <w:r>
         <w:t xml:space="preserve">Рис. </w:t>
       </w:r>
-      <w:r>
-        <w:fldChar w:fldCharType="begin"/>
-      </w:r>
-      <w:r>
-        <w:instrText xml:space="preserve"> SEQ Рис. \* ARABIC </w:instrText>
-      </w:r>
-      <w:r>
-        <w:fldChar w:fldCharType="separate"/>
-      </w:r>
-      <w:r>
-        <w:rPr>
-          <w:noProof/>
-        </w:rPr>
-        <w:t>17</w:t>
-      </w:r>
-      <w:r>
-        <w:fldChar w:fldCharType="end"/>
-      </w:r>
+      <w:fldSimple w:instr=" SEQ Рис. \* ARABIC ">
+        <w:r>
+          <w:rPr>
+            <w:noProof/>
+          </w:rPr>
+          <w:t>17</w:t>
+        </w:r>
+      </w:fldSimple>
       <w:r>
         <w:t>. Таблица отличников по всем предметам</w:t>
       </w:r>
@@ -10955,11 +10902,11 @@
       </w:r>
       <w:proofErr w:type="spellEnd"/>
       <w:r>
-        <w:t xml:space="preserve">, возвращающая разницу между двумя датами в заданном формате. Возвращаемое значение функции будет сравниваться с числом 20, а параметрами для функции будут выступать: </w:t>
+        <w:t xml:space="preserve">, возвращающая разницу между двумя датами в заданном формате. Возвращаемое значение функции будет сравниваться с числом 20, а параметрами для функции будут выступать: формат «только </w:t>
       </w:r>
       <w:r>
         <w:lastRenderedPageBreak/>
-        <w:t>формат «только год», дата рождения студента, текущая дата. Итоговый запрос выглядит следующим образом:</w:t>
+        <w:t>год», дата рождения студента, текущая дата. Итоговый запрос выглядит следующим образом:</w:t>
       </w:r>
     </w:p>
     <w:p>
@@ -10975,7 +10922,7 @@
         <w:tblLook w:val="04A0" w:firstRow="1" w:lastRow="0" w:firstColumn="1" w:lastColumn="0" w:noHBand="0" w:noVBand="1"/>
       </w:tblPr>
       <w:tblGrid>
-        <w:gridCol w:w="8625"/>
+        <w:gridCol w:w="8908"/>
       </w:tblGrid>
       <w:tr>
         <w:tc>
@@ -11167,6 +11114,9 @@
     <w:p>
       <w:pPr>
         <w:pStyle w:val="a5"/>
+        <w:rPr>
+          <w:lang w:val="en-US"/>
+        </w:rPr>
       </w:pPr>
     </w:p>
     <w:p>
@@ -11243,24 +11193,14 @@
       <w:r>
         <w:t xml:space="preserve">Рис. </w:t>
       </w:r>
-      <w:r>
-        <w:fldChar w:fldCharType="begin"/>
-      </w:r>
-      <w:r>
-        <w:instrText xml:space="preserve"> SEQ Рис. \* ARABIC </w:instrText>
-      </w:r>
-      <w:r>
-        <w:fldChar w:fldCharType="separate"/>
-      </w:r>
-      <w:r>
-        <w:rPr>
-          <w:noProof/>
-        </w:rPr>
-        <w:t>18</w:t>
-      </w:r>
-      <w:r>
-        <w:fldChar w:fldCharType="end"/>
-      </w:r>
+      <w:fldSimple w:instr=" SEQ Рис. \* ARABIC ">
+        <w:r>
+          <w:rPr>
+            <w:noProof/>
+          </w:rPr>
+          <w:t>18</w:t>
+        </w:r>
+      </w:fldSimple>
       <w:r>
         <w:t>. Таблица студентов старше 20</w:t>
       </w:r>
@@ -11558,7 +11498,7 @@
       <w:headerReference w:type="first" r:id="rId26"/>
       <w:footerReference w:type="first" r:id="rId27"/>
       <w:pgSz w:w="11906" w:h="16838"/>
-      <w:pgMar w:top="1134" w:right="850" w:bottom="1134" w:left="1701" w:header="708" w:footer="708" w:gutter="0"/>
+      <w:pgMar w:top="1134" w:right="567" w:bottom="1134" w:left="1701" w:header="708" w:footer="708" w:gutter="0"/>
       <w:cols w:space="708"/>
       <w:titlePg/>
       <w:docGrid w:linePitch="381"/>
@@ -13149,6 +13089,7 @@
   <w:style w:type="character" w:default="1" w:styleId="a0">
     <w:name w:val="Default Paragraph Font"/>
     <w:uiPriority w:val="1"/>
+    <w:semiHidden/>
     <w:unhideWhenUsed/>
   </w:style>
   <w:style w:type="table" w:default="1" w:styleId="a1">

</xml_diff>

<commit_message>
vault backup: 2025-12-22 22:01:09
</commit_message>
<xml_diff>
--- a/Курс 3/Базы данных/Лабораторные/05. SQL/Документ Microsoft Word.docx
+++ b/Курс 3/Базы данных/Лабораторные/05. SQL/Документ Microsoft Word.docx
@@ -459,7 +459,7 @@
           <w:color w:val="000000"/>
           <w:spacing w:val="-11"/>
           <w:szCs w:val="28"/>
-          <w:lang w:val="en-US" w:eastAsia="ru-RU"/>
+          <w:lang w:eastAsia="ru-RU"/>
         </w:rPr>
         <w:t xml:space="preserve"> </w:t>
       </w:r>
@@ -604,7 +604,7 @@
           <w:color w:val="000000"/>
           <w:spacing w:val="-11"/>
           <w:szCs w:val="28"/>
-          <w:lang w:val="en-US" w:eastAsia="ru-RU"/>
+          <w:lang w:eastAsia="ru-RU"/>
         </w:rPr>
         <w:t xml:space="preserve"> </w:t>
       </w:r>
@@ -672,29 +672,7 @@
           <w:szCs w:val="28"/>
           <w:lang w:eastAsia="ru-RU"/>
         </w:rPr>
-        <w:t xml:space="preserve">доцент, к.т.н. </w:t>
-      </w:r>
-      <w:proofErr w:type="spellStart"/>
-      <w:r>
-        <w:rPr>
-          <w:rFonts w:eastAsia="Times New Roman" w:cs="Times New Roman"/>
-          <w:color w:val="000000"/>
-          <w:spacing w:val="-11"/>
-          <w:szCs w:val="28"/>
-          <w:lang w:eastAsia="ru-RU"/>
-        </w:rPr>
-        <w:t>Селяничев</w:t>
-      </w:r>
-      <w:proofErr w:type="spellEnd"/>
-      <w:r>
-        <w:rPr>
-          <w:rFonts w:eastAsia="Times New Roman" w:cs="Times New Roman"/>
-          <w:color w:val="000000"/>
-          <w:spacing w:val="-11"/>
-          <w:szCs w:val="28"/>
-          <w:lang w:eastAsia="ru-RU"/>
-        </w:rPr>
-        <w:t xml:space="preserve"> Олег Леонидович</w:t>
+        <w:t>доцент, к.т.н. Селяничев Олег Леонидович</w:t>
       </w:r>
     </w:p>
     <w:p>
@@ -824,7 +802,235 @@
         <w:ind w:firstLine="0"/>
       </w:pPr>
       <w:r>
+        <w:rPr>
+          <w:lang w:val="en-US"/>
+        </w:rPr>
         <w:lastRenderedPageBreak/>
+        <w:t xml:space="preserve">SQL (Structured Query Language) - </w:t>
+      </w:r>
+      <w:r>
+        <w:t>непроцедурный</w:t>
+      </w:r>
+      <w:r>
+        <w:rPr>
+          <w:lang w:val="en-US"/>
+        </w:rPr>
+        <w:t xml:space="preserve"> </w:t>
+      </w:r>
+      <w:r>
+        <w:t>язык</w:t>
+      </w:r>
+      <w:r>
+        <w:rPr>
+          <w:lang w:val="en-US"/>
+        </w:rPr>
+        <w:t xml:space="preserve">, </w:t>
+      </w:r>
+      <w:r>
+        <w:t>состоящий</w:t>
+      </w:r>
+      <w:r>
+        <w:rPr>
+          <w:lang w:val="en-US"/>
+        </w:rPr>
+        <w:t xml:space="preserve"> </w:t>
+      </w:r>
+      <w:r>
+        <w:t>из</w:t>
+      </w:r>
+      <w:r>
+        <w:rPr>
+          <w:lang w:val="en-US"/>
+        </w:rPr>
+        <w:t xml:space="preserve"> </w:t>
+      </w:r>
+      <w:r>
+        <w:t>трёх</w:t>
+      </w:r>
+      <w:r>
+        <w:rPr>
+          <w:lang w:val="en-US"/>
+        </w:rPr>
+        <w:t xml:space="preserve"> </w:t>
+      </w:r>
+      <w:r>
+        <w:t>групп</w:t>
+      </w:r>
+      <w:r>
+        <w:rPr>
+          <w:lang w:val="en-US"/>
+        </w:rPr>
+        <w:t xml:space="preserve"> </w:t>
+      </w:r>
+      <w:r>
+        <w:t>операторов</w:t>
+      </w:r>
+      <w:r>
+        <w:rPr>
+          <w:lang w:val="en-US"/>
+        </w:rPr>
+        <w:t xml:space="preserve">: SQL = DDL (Data Definition Language) + DML (Data Manipulation Language) + DQL (Data Query Language) + </w:t>
+      </w:r>
+      <w:r>
+        <w:rPr>
+          <w:lang w:val="en-US"/>
+        </w:rPr>
+        <w:t>…</w:t>
+      </w:r>
+      <w:r>
+        <w:rPr>
+          <w:lang w:val="en-US"/>
+        </w:rPr>
+        <w:t xml:space="preserve"> </w:t>
+      </w:r>
+      <w:r>
+        <w:t>Используется для управления базами данных.</w:t>
+      </w:r>
+      <w:r>
+        <w:t xml:space="preserve"> </w:t>
+      </w:r>
+      <w:r>
+        <w:t>В инструменты языка входят:</w:t>
+      </w:r>
+    </w:p>
+    <w:p>
+      <w:pPr>
+        <w:pStyle w:val="a5"/>
+        <w:numPr>
+          <w:ilvl w:val="0"/>
+          <w:numId w:val="11"/>
+        </w:numPr>
+      </w:pPr>
+      <w:r>
+        <w:t>средства определения и манипулирования схемой БД;</w:t>
+      </w:r>
+    </w:p>
+    <w:p>
+      <w:pPr>
+        <w:pStyle w:val="a5"/>
+        <w:numPr>
+          <w:ilvl w:val="0"/>
+          <w:numId w:val="11"/>
+        </w:numPr>
+      </w:pPr>
+      <w:r>
+        <w:t>манипулирование записями БД;</w:t>
+      </w:r>
+    </w:p>
+    <w:p>
+      <w:pPr>
+        <w:pStyle w:val="a5"/>
+        <w:numPr>
+          <w:ilvl w:val="0"/>
+          <w:numId w:val="11"/>
+        </w:numPr>
+      </w:pPr>
+      <w:r>
+        <w:t>операторы запросов;</w:t>
+      </w:r>
+    </w:p>
+    <w:p>
+      <w:pPr>
+        <w:pStyle w:val="a5"/>
+        <w:numPr>
+          <w:ilvl w:val="0"/>
+          <w:numId w:val="11"/>
+        </w:numPr>
+      </w:pPr>
+      <w:r>
+        <w:t xml:space="preserve">операторы определения ограничения </w:t>
+      </w:r>
+      <w:proofErr w:type="spellStart"/>
+      <w:r>
+        <w:t>целосности</w:t>
+      </w:r>
+      <w:proofErr w:type="spellEnd"/>
+      <w:r>
+        <w:t>;</w:t>
+      </w:r>
+    </w:p>
+    <w:p>
+      <w:pPr>
+        <w:pStyle w:val="a5"/>
+        <w:numPr>
+          <w:ilvl w:val="0"/>
+          <w:numId w:val="11"/>
+        </w:numPr>
+      </w:pPr>
+      <w:r>
+        <w:t>операторы представлений;</w:t>
+      </w:r>
+    </w:p>
+    <w:p>
+      <w:pPr>
+        <w:pStyle w:val="a5"/>
+        <w:numPr>
+          <w:ilvl w:val="0"/>
+          <w:numId w:val="11"/>
+        </w:numPr>
+      </w:pPr>
+      <w:r>
+        <w:t>операторы триггеров;</w:t>
+      </w:r>
+    </w:p>
+    <w:p>
+      <w:pPr>
+        <w:pStyle w:val="a5"/>
+        <w:numPr>
+          <w:ilvl w:val="0"/>
+          <w:numId w:val="11"/>
+        </w:numPr>
+      </w:pPr>
+      <w:r>
+        <w:t>операторы определения структур физического уровня для эффективного выполнения запросов (индексные файлы);</w:t>
+      </w:r>
+    </w:p>
+    <w:p>
+      <w:pPr>
+        <w:pStyle w:val="a5"/>
+        <w:numPr>
+          <w:ilvl w:val="0"/>
+          <w:numId w:val="11"/>
+        </w:numPr>
+      </w:pPr>
+      <w:r>
+        <w:t>операторы авторизации доступа к отношениям и полям;</w:t>
+      </w:r>
+    </w:p>
+    <w:p>
+      <w:pPr>
+        <w:pStyle w:val="a5"/>
+        <w:numPr>
+          <w:ilvl w:val="0"/>
+          <w:numId w:val="11"/>
+        </w:numPr>
+      </w:pPr>
+      <w:r>
+        <w:t>операторы работы с точками сохранения транзакции и откатов;</w:t>
+      </w:r>
+    </w:p>
+    <w:p>
+      <w:pPr>
+        <w:pStyle w:val="a5"/>
+        <w:numPr>
+          <w:ilvl w:val="0"/>
+          <w:numId w:val="11"/>
+        </w:numPr>
+      </w:pPr>
+      <w:r>
+        <w:t>и т.д.</w:t>
+      </w:r>
+    </w:p>
+    <w:p>
+      <w:pPr>
+        <w:ind w:firstLine="0"/>
+      </w:pPr>
+    </w:p>
+    <w:p>
+      <w:pPr>
+        <w:ind w:firstLine="0"/>
+      </w:pPr>
+      <w:r>
         <w:t>Часть 1.</w:t>
       </w:r>
     </w:p>
@@ -912,9 +1118,9 @@
           <w:noProof/>
         </w:rPr>
         <w:drawing>
-          <wp:inline distT="0" distB="0" distL="0" distR="0" wp14:anchorId="12774CA8" wp14:editId="05C49640">
-            <wp:extent cx="5940425" cy="3961765"/>
-            <wp:effectExtent l="0" t="0" r="3175" b="635"/>
+          <wp:inline distT="0" distB="0" distL="0" distR="0" wp14:anchorId="12774CA8" wp14:editId="74208575">
+            <wp:extent cx="5088570" cy="3393649"/>
+            <wp:effectExtent l="0" t="0" r="4445" b="0"/>
             <wp:docPr id="1711615213" name="Рисунок 1"/>
             <wp:cNvGraphicFramePr>
               <a:graphicFrameLocks xmlns:a="http://schemas.openxmlformats.org/drawingml/2006/main" noChangeAspect="1"/>
@@ -935,7 +1141,7 @@
                   <pic:spPr>
                     <a:xfrm>
                       <a:off x="0" y="0"/>
-                      <a:ext cx="5949246" cy="3967648"/>
+                      <a:ext cx="5128930" cy="3420566"/>
                     </a:xfrm>
                     <a:prstGeom prst="rect">
                       <a:avLst/>
@@ -969,6 +1175,7 @@
     </w:p>
     <w:p>
       <w:r>
+        <w:lastRenderedPageBreak/>
         <w:t>Панель инструментов состоит из 5 разделов. Поначалу довольно трудно различить разделение между ними, однако, обнаружив и передвинув рычажки начала разделов левой кнопкой мыши, можно сдвинуть весь раздел по панели инструментов и разделы станут видны более чётко (рис. 2).</w:t>
       </w:r>
     </w:p>
@@ -1040,7 +1247,6 @@
     </w:p>
     <w:p>
       <w:r>
-        <w:lastRenderedPageBreak/>
         <w:t>В первом разделе находятся следующие кнопки:</w:t>
       </w:r>
     </w:p>
@@ -1985,6 +2191,7 @@
         <w:rPr>
           <w:lang w:val="en-US"/>
         </w:rPr>
+        <w:lastRenderedPageBreak/>
         <w:t>Print</w:t>
       </w:r>
       <w:r>
@@ -2224,7 +2431,6 @@
         <w:rPr>
           <w:lang w:val="en-US"/>
         </w:rPr>
-        <w:lastRenderedPageBreak/>
         <w:t>Refresh</w:t>
       </w:r>
       <w:r>
@@ -2760,9 +2966,9 @@
         </w:rPr>
         <w:lastRenderedPageBreak/>
         <w:drawing>
-          <wp:inline distT="0" distB="0" distL="0" distR="0" wp14:anchorId="77619812" wp14:editId="5A77F976">
-            <wp:extent cx="4016735" cy="3282087"/>
-            <wp:effectExtent l="0" t="0" r="3175" b="0"/>
+          <wp:inline distT="0" distB="0" distL="0" distR="0" wp14:anchorId="77619812" wp14:editId="2DE7CF58">
+            <wp:extent cx="3564889" cy="2912882"/>
+            <wp:effectExtent l="0" t="0" r="4445" b="0"/>
             <wp:docPr id="986312234" name="Рисунок 1"/>
             <wp:cNvGraphicFramePr>
               <a:graphicFrameLocks xmlns:a="http://schemas.openxmlformats.org/drawingml/2006/main" noChangeAspect="1"/>
@@ -2783,7 +2989,7 @@
                   <pic:spPr>
                     <a:xfrm>
                       <a:off x="0" y="0"/>
-                      <a:ext cx="4022784" cy="3287030"/>
+                      <a:ext cx="3606375" cy="2946781"/>
                     </a:xfrm>
                     <a:prstGeom prst="rect">
                       <a:avLst/>
@@ -2951,11 +3157,7 @@
         <w:t>SQL</w:t>
       </w:r>
       <w:r>
-        <w:t xml:space="preserve">, вкладка параметров, вкладка табличного представления, вкладка </w:t>
-      </w:r>
-      <w:r>
-        <w:lastRenderedPageBreak/>
-        <w:t>разрешений, вкладка операций. Внешний вид некоторых вкладок раздела свойств для таблицы базы данных представлен на рис. 5–7.</w:t>
+        <w:t>, вкладка параметров, вкладка табличного представления, вкладка разрешений, вкладка операций. Внешний вид некоторых вкладок раздела свойств для таблицы базы данных представлен на рис. 5–7.</w:t>
       </w:r>
     </w:p>
     <w:p/>
@@ -2968,10 +3170,11 @@
         <w:rPr>
           <w:noProof/>
         </w:rPr>
+        <w:lastRenderedPageBreak/>
         <w:drawing>
-          <wp:inline distT="0" distB="0" distL="0" distR="0" wp14:anchorId="13889324" wp14:editId="197490A2">
-            <wp:extent cx="3336626" cy="1570588"/>
-            <wp:effectExtent l="0" t="0" r="0" b="0"/>
+          <wp:inline distT="0" distB="0" distL="0" distR="0" wp14:anchorId="13889324" wp14:editId="47B94340">
+            <wp:extent cx="2875175" cy="1353377"/>
+            <wp:effectExtent l="0" t="0" r="0" b="5715"/>
             <wp:docPr id="759028609" name="Рисунок 1"/>
             <wp:cNvGraphicFramePr>
               <a:graphicFrameLocks xmlns:a="http://schemas.openxmlformats.org/drawingml/2006/main" noChangeAspect="1"/>
@@ -2992,7 +3195,7 @@
                   <pic:spPr>
                     <a:xfrm>
                       <a:off x="0" y="0"/>
-                      <a:ext cx="3355725" cy="1579578"/>
+                      <a:ext cx="2925837" cy="1377224"/>
                     </a:xfrm>
                     <a:prstGeom prst="rect">
                       <a:avLst/>
@@ -3034,9 +3237,9 @@
           <w:noProof/>
         </w:rPr>
         <w:drawing>
-          <wp:inline distT="0" distB="0" distL="0" distR="0" wp14:anchorId="2E376BBA" wp14:editId="7795CC5F">
-            <wp:extent cx="3324764" cy="1586819"/>
-            <wp:effectExtent l="0" t="0" r="0" b="0"/>
+          <wp:inline distT="0" distB="0" distL="0" distR="0" wp14:anchorId="2E376BBA" wp14:editId="402B784D">
+            <wp:extent cx="2865749" cy="1367744"/>
+            <wp:effectExtent l="0" t="0" r="5080" b="4445"/>
             <wp:docPr id="1104393123" name="Рисунок 1"/>
             <wp:cNvGraphicFramePr>
               <a:graphicFrameLocks xmlns:a="http://schemas.openxmlformats.org/drawingml/2006/main" noChangeAspect="1"/>
@@ -3057,7 +3260,7 @@
                   <pic:spPr>
                     <a:xfrm>
                       <a:off x="0" y="0"/>
-                      <a:ext cx="3349495" cy="1598622"/>
+                      <a:ext cx="2925577" cy="1396298"/>
                     </a:xfrm>
                     <a:prstGeom prst="rect">
                       <a:avLst/>
@@ -3099,9 +3302,9 @@
           <w:noProof/>
         </w:rPr>
         <w:drawing>
-          <wp:inline distT="0" distB="0" distL="0" distR="0" wp14:anchorId="260BEC1D" wp14:editId="7302214E">
-            <wp:extent cx="3579602" cy="1469922"/>
-            <wp:effectExtent l="0" t="0" r="1905" b="0"/>
+          <wp:inline distT="0" distB="0" distL="0" distR="0" wp14:anchorId="260BEC1D" wp14:editId="6022C507">
+            <wp:extent cx="2837468" cy="1165173"/>
+            <wp:effectExtent l="0" t="0" r="0" b="3810"/>
             <wp:docPr id="808211358" name="Рисунок 1"/>
             <wp:cNvGraphicFramePr>
               <a:graphicFrameLocks xmlns:a="http://schemas.openxmlformats.org/drawingml/2006/main" noChangeAspect="1"/>
@@ -3122,7 +3325,7 @@
                   <pic:spPr>
                     <a:xfrm>
                       <a:off x="0" y="0"/>
-                      <a:ext cx="3598004" cy="1477479"/>
+                      <a:ext cx="2918422" cy="1198416"/>
                     </a:xfrm>
                     <a:prstGeom prst="rect">
                       <a:avLst/>
@@ -3180,6 +3383,7 @@
         <w:t>-запросов. Раздел под ним же отображает результат выполнения запроса в виде таблицы (если он есть). Внешний вид обоих разделов показан на рис. 8.</w:t>
       </w:r>
     </w:p>
+    <w:p/>
     <w:p>
       <w:pPr>
         <w:keepNext/>
@@ -3189,11 +3393,10 @@
         <w:rPr>
           <w:noProof/>
         </w:rPr>
-        <w:lastRenderedPageBreak/>
         <w:drawing>
-          <wp:inline distT="0" distB="0" distL="0" distR="0" wp14:anchorId="60BBF088" wp14:editId="301C5CD4">
-            <wp:extent cx="3065963" cy="3422315"/>
-            <wp:effectExtent l="0" t="0" r="1270" b="6985"/>
+          <wp:inline distT="0" distB="0" distL="0" distR="0" wp14:anchorId="60BBF088" wp14:editId="6C1E4C68">
+            <wp:extent cx="2803818" cy="3129699"/>
+            <wp:effectExtent l="0" t="0" r="3175" b="0"/>
             <wp:docPr id="2129632825" name="Рисунок 1"/>
             <wp:cNvGraphicFramePr>
               <a:graphicFrameLocks xmlns:a="http://schemas.openxmlformats.org/drawingml/2006/main" noChangeAspect="1"/>
@@ -3214,7 +3417,7 @@
                   <pic:spPr>
                     <a:xfrm>
                       <a:off x="0" y="0"/>
-                      <a:ext cx="3088141" cy="3447070"/>
+                      <a:ext cx="2914210" cy="3252921"/>
                     </a:xfrm>
                     <a:prstGeom prst="rect">
                       <a:avLst/>
@@ -3246,12 +3449,15 @@
         <w:t>. Разделы для работы с запросами</w:t>
       </w:r>
     </w:p>
-    <w:p/>
     <w:p>
       <w:pPr>
         <w:ind w:firstLine="0"/>
-      </w:pPr>
-      <w:r>
+        <w:rPr>
+          <w:lang w:val="en-US"/>
+        </w:rPr>
+      </w:pPr>
+      <w:r>
+        <w:lastRenderedPageBreak/>
         <w:t>Часть 2.</w:t>
       </w:r>
     </w:p>
@@ -4007,11 +4213,7 @@
         <w:t xml:space="preserve"> </w:t>
       </w:r>
       <w:r>
-        <w:t xml:space="preserve">для записи изменений в базу. Результатом </w:t>
-      </w:r>
-      <w:r>
-        <w:lastRenderedPageBreak/>
-        <w:t xml:space="preserve">выполнения </w:t>
+        <w:t xml:space="preserve">для записи изменений в базу. Результатом выполнения </w:t>
       </w:r>
       <w:r>
         <w:rPr>
@@ -4211,6 +4413,7 @@
         </w:numPr>
       </w:pPr>
       <w:r>
+        <w:lastRenderedPageBreak/>
         <w:t>Задание: Внесите в таблицу 5 записей.</w:t>
       </w:r>
     </w:p>
@@ -4534,18 +4737,8 @@
                 <w:sz w:val="20"/>
                 <w:szCs w:val="20"/>
               </w:rPr>
-              <w:t>, 5</w:t>
-            </w:r>
-            <w:proofErr w:type="gramStart"/>
-            <w:r>
-              <w:rPr>
-                <w:rFonts w:ascii="Cascadia Mono" w:hAnsi="Cascadia Mono"/>
-                <w:sz w:val="20"/>
-                <w:szCs w:val="20"/>
-              </w:rPr>
-              <w:t>);</w:t>
-            </w:r>
-            <w:proofErr w:type="gramEnd"/>
+              <w:t>, 5);</w:t>
+            </w:r>
           </w:p>
           <w:p>
             <w:pPr>
@@ -4755,7 +4948,6 @@
               </w:rPr>
               <w:t>3</w:t>
             </w:r>
-            <w:proofErr w:type="gramStart"/>
             <w:r>
               <w:rPr>
                 <w:rFonts w:ascii="Cascadia Mono" w:hAnsi="Cascadia Mono"/>
@@ -4764,7 +4956,6 @@
               </w:rPr>
               <w:t>);</w:t>
             </w:r>
-            <w:proofErr w:type="gramEnd"/>
           </w:p>
           <w:p>
             <w:pPr>
@@ -4958,7 +5149,6 @@
               </w:rPr>
               <w:t>4</w:t>
             </w:r>
-            <w:proofErr w:type="gramStart"/>
             <w:r>
               <w:rPr>
                 <w:rFonts w:ascii="Cascadia Mono" w:hAnsi="Cascadia Mono"/>
@@ -4967,7 +5157,6 @@
               </w:rPr>
               <w:t>);</w:t>
             </w:r>
-            <w:proofErr w:type="gramEnd"/>
           </w:p>
           <w:p>
             <w:pPr>
@@ -5135,18 +5324,8 @@
                 <w:sz w:val="20"/>
                 <w:szCs w:val="20"/>
               </w:rPr>
-              <w:t>', 5, 4, 5</w:t>
-            </w:r>
-            <w:proofErr w:type="gramStart"/>
-            <w:r>
-              <w:rPr>
-                <w:rFonts w:ascii="Cascadia Mono" w:hAnsi="Cascadia Mono"/>
-                <w:sz w:val="20"/>
-                <w:szCs w:val="20"/>
-              </w:rPr>
-              <w:t>);</w:t>
-            </w:r>
-            <w:proofErr w:type="gramEnd"/>
+              <w:t>', 5, 4, 5);</w:t>
+            </w:r>
           </w:p>
           <w:p>
             <w:pPr>
@@ -5314,11 +5493,10 @@
         <w:rPr>
           <w:noProof/>
         </w:rPr>
-        <w:lastRenderedPageBreak/>
         <w:drawing>
-          <wp:inline distT="0" distB="0" distL="0" distR="0" wp14:anchorId="7E68ACA9" wp14:editId="10B4CE1A">
-            <wp:extent cx="4602076" cy="1387756"/>
-            <wp:effectExtent l="0" t="0" r="8255" b="3175"/>
+          <wp:inline distT="0" distB="0" distL="0" distR="0" wp14:anchorId="7E68ACA9" wp14:editId="2EFB9466">
+            <wp:extent cx="4421171" cy="1333204"/>
+            <wp:effectExtent l="0" t="0" r="0" b="635"/>
             <wp:docPr id="5" name="Рисунок 5"/>
             <wp:cNvGraphicFramePr>
               <a:graphicFrameLocks xmlns:a="http://schemas.openxmlformats.org/drawingml/2006/main" noChangeAspect="1"/>
@@ -5339,7 +5517,7 @@
                   <pic:spPr>
                     <a:xfrm>
                       <a:off x="0" y="0"/>
-                      <a:ext cx="4648194" cy="1401663"/>
+                      <a:ext cx="4442005" cy="1339487"/>
                     </a:xfrm>
                     <a:prstGeom prst="rect">
                       <a:avLst/>
@@ -5683,9 +5861,9 @@
           <w:lang w:val="en-US"/>
         </w:rPr>
         <w:drawing>
-          <wp:inline distT="0" distB="0" distL="0" distR="0" wp14:anchorId="035374EB" wp14:editId="33B91B10">
-            <wp:extent cx="2943636" cy="1686160"/>
-            <wp:effectExtent l="0" t="0" r="9525" b="9525"/>
+          <wp:inline distT="0" distB="0" distL="0" distR="0" wp14:anchorId="035374EB" wp14:editId="33638B34">
+            <wp:extent cx="2384981" cy="1366154"/>
+            <wp:effectExtent l="0" t="0" r="3175" b="5715"/>
             <wp:docPr id="1" name="Рисунок 1"/>
             <wp:cNvGraphicFramePr>
               <a:graphicFrameLocks xmlns:a="http://schemas.openxmlformats.org/drawingml/2006/main" noChangeAspect="1"/>
@@ -5706,7 +5884,7 @@
                   <pic:spPr>
                     <a:xfrm>
                       <a:off x="0" y="0"/>
-                      <a:ext cx="2943636" cy="1686160"/>
+                      <a:ext cx="2445780" cy="1400981"/>
                     </a:xfrm>
                     <a:prstGeom prst="rect">
                       <a:avLst/>
@@ -5885,16 +6063,7 @@
                 <w:sz w:val="20"/>
                 <w:szCs w:val="20"/>
               </w:rPr>
-              <w:t>имя_</w:t>
-            </w:r>
-            <w:proofErr w:type="gramStart"/>
-            <w:r>
-              <w:rPr>
-                <w:rFonts w:ascii="Cascadia Mono" w:hAnsi="Cascadia Mono"/>
-                <w:sz w:val="20"/>
-                <w:szCs w:val="20"/>
-              </w:rPr>
-              <w:t>поля</w:t>
+              <w:t>имя_поля</w:t>
             </w:r>
             <w:proofErr w:type="spellEnd"/>
             <w:r>
@@ -5903,16 +6072,7 @@
                 <w:sz w:val="20"/>
                 <w:szCs w:val="20"/>
               </w:rPr>
-              <w:t>&gt;=</w:t>
-            </w:r>
-            <w:proofErr w:type="gramEnd"/>
-            <w:r>
-              <w:rPr>
-                <w:rFonts w:ascii="Cascadia Mono" w:hAnsi="Cascadia Mono"/>
-                <w:sz w:val="20"/>
-                <w:szCs w:val="20"/>
-              </w:rPr>
-              <w:t xml:space="preserve">&lt;выражение&gt; </w:t>
+              <w:t xml:space="preserve">&gt;=&lt;выражение&gt; </w:t>
             </w:r>
           </w:p>
           <w:p>
@@ -5931,7 +6091,6 @@
                 <w:sz w:val="20"/>
                 <w:szCs w:val="20"/>
               </w:rPr>
-              <w:lastRenderedPageBreak/>
               <w:t xml:space="preserve">    </w:t>
             </w:r>
             <w:r>
@@ -5976,16 +6135,7 @@
                 <w:sz w:val="20"/>
                 <w:szCs w:val="20"/>
               </w:rPr>
-              <w:t>имя_</w:t>
-            </w:r>
-            <w:proofErr w:type="gramStart"/>
-            <w:r>
-              <w:rPr>
-                <w:rFonts w:ascii="Cascadia Mono" w:hAnsi="Cascadia Mono"/>
-                <w:sz w:val="20"/>
-                <w:szCs w:val="20"/>
-              </w:rPr>
-              <w:t>поля</w:t>
+              <w:t>имя_поля</w:t>
             </w:r>
             <w:proofErr w:type="spellEnd"/>
             <w:r>
@@ -5994,16 +6144,7 @@
                 <w:sz w:val="20"/>
                 <w:szCs w:val="20"/>
               </w:rPr>
-              <w:t>&gt;=</w:t>
-            </w:r>
-            <w:proofErr w:type="gramEnd"/>
-            <w:r>
-              <w:rPr>
-                <w:rFonts w:ascii="Cascadia Mono" w:hAnsi="Cascadia Mono"/>
-                <w:sz w:val="20"/>
-                <w:szCs w:val="20"/>
-              </w:rPr>
-              <w:t xml:space="preserve">&lt;выражение&gt; </w:t>
+              <w:t xml:space="preserve">&gt;=&lt;выражение&gt; </w:t>
             </w:r>
           </w:p>
           <w:p>
@@ -6192,7 +6333,6 @@
               </w:rPr>
               <w:t>Кринкин</w:t>
             </w:r>
-            <w:proofErr w:type="gramStart"/>
             <w:r>
               <w:rPr>
                 <w:rFonts w:ascii="Cascadia Mono" w:hAnsi="Cascadia Mono"/>
@@ -6211,7 +6351,6 @@
               </w:rPr>
               <w:t>;</w:t>
             </w:r>
-            <w:proofErr w:type="gramEnd"/>
           </w:p>
           <w:p>
             <w:pPr>
@@ -6874,19 +7013,8 @@
                 <w:szCs w:val="20"/>
                 <w:lang w:val="en-US"/>
               </w:rPr>
-              <w:t xml:space="preserve">    SELECT * FROM </w:t>
-            </w:r>
-            <w:proofErr w:type="gramStart"/>
-            <w:r>
-              <w:rPr>
-                <w:rFonts w:ascii="Cascadia Mono" w:hAnsi="Cascadia Mono"/>
-                <w:sz w:val="20"/>
-                <w:szCs w:val="20"/>
-                <w:lang w:val="en-US"/>
-              </w:rPr>
-              <w:t>student1;</w:t>
-            </w:r>
-            <w:proofErr w:type="gramEnd"/>
+              <w:t xml:space="preserve">    SELECT * FROM student1;</w:t>
+            </w:r>
           </w:p>
           <w:p>
             <w:pPr>
@@ -7144,7 +7272,6 @@
         </w:numPr>
       </w:pPr>
       <w:r>
-        <w:lastRenderedPageBreak/>
         <w:t>Задание: Создайте таблицу с теми же полями – она будет содержать сведения о студентах параллельной группы. Решите это задание способом, отличным от того, каким было выполнено задание 1.</w:t>
       </w:r>
     </w:p>
@@ -7793,66 +7920,56 @@
                 <w:sz w:val="20"/>
                 <w:szCs w:val="20"/>
               </w:rPr>
+              <w:t xml:space="preserve">', </w:t>
+            </w:r>
+            <w:r>
+              <w:rPr>
+                <w:rFonts w:ascii="Cascadia Mono" w:hAnsi="Cascadia Mono"/>
+                <w:sz w:val="20"/>
+                <w:szCs w:val="20"/>
+              </w:rPr>
+              <w:t>5</w:t>
+            </w:r>
+            <w:r>
+              <w:rPr>
+                <w:rFonts w:ascii="Cascadia Mono" w:hAnsi="Cascadia Mono"/>
+                <w:sz w:val="20"/>
+                <w:szCs w:val="20"/>
+              </w:rPr>
+              <w:t xml:space="preserve">, </w:t>
+            </w:r>
+            <w:r>
+              <w:rPr>
+                <w:rFonts w:ascii="Cascadia Mono" w:hAnsi="Cascadia Mono"/>
+                <w:sz w:val="20"/>
+                <w:szCs w:val="20"/>
+              </w:rPr>
+              <w:t>5</w:t>
+            </w:r>
+            <w:r>
+              <w:rPr>
+                <w:rFonts w:ascii="Cascadia Mono" w:hAnsi="Cascadia Mono"/>
+                <w:sz w:val="20"/>
+                <w:szCs w:val="20"/>
+              </w:rPr>
+              <w:t>, 5</w:t>
+            </w:r>
+            <w:r>
+              <w:rPr>
+                <w:rFonts w:ascii="Cascadia Mono" w:hAnsi="Cascadia Mono"/>
+                <w:sz w:val="20"/>
+                <w:szCs w:val="20"/>
+              </w:rPr>
+              <w:t xml:space="preserve">, </w:t>
+            </w:r>
+            <w:r>
+              <w:rPr>
+                <w:rFonts w:ascii="Cascadia Mono" w:hAnsi="Cascadia Mono"/>
+                <w:sz w:val="20"/>
+                <w:szCs w:val="20"/>
+              </w:rPr>
               <w:t>'</w:t>
             </w:r>
-            <w:proofErr w:type="gramStart"/>
-            <w:r>
-              <w:rPr>
-                <w:rFonts w:ascii="Cascadia Mono" w:hAnsi="Cascadia Mono"/>
-                <w:sz w:val="20"/>
-                <w:szCs w:val="20"/>
-              </w:rPr>
-              <w:t xml:space="preserve">, </w:t>
-            </w:r>
-            <w:r>
-              <w:rPr>
-                <w:rFonts w:ascii="Cascadia Mono" w:hAnsi="Cascadia Mono"/>
-                <w:sz w:val="20"/>
-                <w:szCs w:val="20"/>
-              </w:rPr>
-              <w:t>5</w:t>
-            </w:r>
-            <w:proofErr w:type="gramEnd"/>
-            <w:r>
-              <w:rPr>
-                <w:rFonts w:ascii="Cascadia Mono" w:hAnsi="Cascadia Mono"/>
-                <w:sz w:val="20"/>
-                <w:szCs w:val="20"/>
-              </w:rPr>
-              <w:t xml:space="preserve">, </w:t>
-            </w:r>
-            <w:r>
-              <w:rPr>
-                <w:rFonts w:ascii="Cascadia Mono" w:hAnsi="Cascadia Mono"/>
-                <w:sz w:val="20"/>
-                <w:szCs w:val="20"/>
-              </w:rPr>
-              <w:t>5</w:t>
-            </w:r>
-            <w:r>
-              <w:rPr>
-                <w:rFonts w:ascii="Cascadia Mono" w:hAnsi="Cascadia Mono"/>
-                <w:sz w:val="20"/>
-                <w:szCs w:val="20"/>
-              </w:rPr>
-              <w:t>, 5</w:t>
-            </w:r>
-            <w:r>
-              <w:rPr>
-                <w:rFonts w:ascii="Cascadia Mono" w:hAnsi="Cascadia Mono"/>
-                <w:sz w:val="20"/>
-                <w:szCs w:val="20"/>
-              </w:rPr>
-              <w:t xml:space="preserve">, </w:t>
-            </w:r>
-            <w:r>
-              <w:rPr>
-                <w:rFonts w:ascii="Cascadia Mono" w:hAnsi="Cascadia Mono"/>
-                <w:sz w:val="20"/>
-                <w:szCs w:val="20"/>
-              </w:rPr>
-              <w:t>'</w:t>
-            </w:r>
             <w:r>
               <w:rPr>
                 <w:rFonts w:ascii="Cascadia Mono" w:hAnsi="Cascadia Mono"/>
@@ -7867,18 +7984,8 @@
                 <w:sz w:val="20"/>
                 <w:szCs w:val="20"/>
               </w:rPr>
-              <w:t>'</w:t>
-            </w:r>
-            <w:proofErr w:type="gramStart"/>
-            <w:r>
-              <w:rPr>
-                <w:rFonts w:ascii="Cascadia Mono" w:hAnsi="Cascadia Mono"/>
-                <w:sz w:val="20"/>
-                <w:szCs w:val="20"/>
-              </w:rPr>
-              <w:t>);</w:t>
-            </w:r>
-            <w:proofErr w:type="gramEnd"/>
+              <w:t>');</w:t>
+            </w:r>
           </w:p>
           <w:p>
             <w:pPr>
@@ -8134,18 +8241,8 @@
                 <w:sz w:val="20"/>
                 <w:szCs w:val="20"/>
               </w:rPr>
-              <w:t>'</w:t>
-            </w:r>
-            <w:proofErr w:type="gramStart"/>
-            <w:r>
-              <w:rPr>
-                <w:rFonts w:ascii="Cascadia Mono" w:hAnsi="Cascadia Mono"/>
-                <w:sz w:val="20"/>
-                <w:szCs w:val="20"/>
-              </w:rPr>
-              <w:t>);</w:t>
-            </w:r>
-            <w:proofErr w:type="gramEnd"/>
+              <w:t>');</w:t>
+            </w:r>
           </w:p>
           <w:p>
             <w:pPr>
@@ -8395,18 +8492,8 @@
                 <w:sz w:val="20"/>
                 <w:szCs w:val="20"/>
               </w:rPr>
-              <w:t>'</w:t>
-            </w:r>
-            <w:proofErr w:type="gramStart"/>
-            <w:r>
-              <w:rPr>
-                <w:rFonts w:ascii="Cascadia Mono" w:hAnsi="Cascadia Mono"/>
-                <w:sz w:val="20"/>
-                <w:szCs w:val="20"/>
-              </w:rPr>
-              <w:t>);</w:t>
-            </w:r>
-            <w:proofErr w:type="gramEnd"/>
+              <w:t>');</w:t>
+            </w:r>
           </w:p>
           <w:p>
             <w:pPr>
@@ -8590,50 +8677,40 @@
                 <w:sz w:val="20"/>
                 <w:szCs w:val="20"/>
               </w:rPr>
+              <w:t xml:space="preserve">', </w:t>
+            </w:r>
+            <w:r>
+              <w:rPr>
+                <w:rFonts w:ascii="Cascadia Mono" w:hAnsi="Cascadia Mono"/>
+                <w:sz w:val="20"/>
+                <w:szCs w:val="20"/>
+              </w:rPr>
+              <w:t>4</w:t>
+            </w:r>
+            <w:r>
+              <w:rPr>
+                <w:rFonts w:ascii="Cascadia Mono" w:hAnsi="Cascadia Mono"/>
+                <w:sz w:val="20"/>
+                <w:szCs w:val="20"/>
+              </w:rPr>
+              <w:t xml:space="preserve">, 4, </w:t>
+            </w:r>
+            <w:r>
+              <w:rPr>
+                <w:rFonts w:ascii="Cascadia Mono" w:hAnsi="Cascadia Mono"/>
+                <w:sz w:val="20"/>
+                <w:szCs w:val="20"/>
+              </w:rPr>
+              <w:t xml:space="preserve">4, </w:t>
+            </w:r>
+            <w:r>
+              <w:rPr>
+                <w:rFonts w:ascii="Cascadia Mono" w:hAnsi="Cascadia Mono"/>
+                <w:sz w:val="20"/>
+                <w:szCs w:val="20"/>
+              </w:rPr>
               <w:t>'</w:t>
             </w:r>
-            <w:proofErr w:type="gramStart"/>
-            <w:r>
-              <w:rPr>
-                <w:rFonts w:ascii="Cascadia Mono" w:hAnsi="Cascadia Mono"/>
-                <w:sz w:val="20"/>
-                <w:szCs w:val="20"/>
-              </w:rPr>
-              <w:t xml:space="preserve">, </w:t>
-            </w:r>
-            <w:r>
-              <w:rPr>
-                <w:rFonts w:ascii="Cascadia Mono" w:hAnsi="Cascadia Mono"/>
-                <w:sz w:val="20"/>
-                <w:szCs w:val="20"/>
-              </w:rPr>
-              <w:t>4</w:t>
-            </w:r>
-            <w:proofErr w:type="gramEnd"/>
-            <w:r>
-              <w:rPr>
-                <w:rFonts w:ascii="Cascadia Mono" w:hAnsi="Cascadia Mono"/>
-                <w:sz w:val="20"/>
-                <w:szCs w:val="20"/>
-              </w:rPr>
-              <w:t xml:space="preserve">, 4, </w:t>
-            </w:r>
-            <w:r>
-              <w:rPr>
-                <w:rFonts w:ascii="Cascadia Mono" w:hAnsi="Cascadia Mono"/>
-                <w:sz w:val="20"/>
-                <w:szCs w:val="20"/>
-              </w:rPr>
-              <w:t xml:space="preserve">4, </w:t>
-            </w:r>
-            <w:r>
-              <w:rPr>
-                <w:rFonts w:ascii="Cascadia Mono" w:hAnsi="Cascadia Mono"/>
-                <w:sz w:val="20"/>
-                <w:szCs w:val="20"/>
-              </w:rPr>
-              <w:t>'</w:t>
-            </w:r>
             <w:r>
               <w:rPr>
                 <w:rFonts w:ascii="Cascadia Mono" w:hAnsi="Cascadia Mono"/>
@@ -8648,18 +8725,8 @@
                 <w:sz w:val="20"/>
                 <w:szCs w:val="20"/>
               </w:rPr>
-              <w:t>'</w:t>
-            </w:r>
-            <w:proofErr w:type="gramStart"/>
-            <w:r>
-              <w:rPr>
-                <w:rFonts w:ascii="Cascadia Mono" w:hAnsi="Cascadia Mono"/>
-                <w:sz w:val="20"/>
-                <w:szCs w:val="20"/>
-              </w:rPr>
-              <w:t>);</w:t>
-            </w:r>
-            <w:proofErr w:type="gramEnd"/>
+              <w:t>');</w:t>
+            </w:r>
           </w:p>
           <w:p>
             <w:pPr>
@@ -8833,7 +8900,6 @@
               </w:rPr>
               <w:t>5</w:t>
             </w:r>
-            <w:proofErr w:type="gramStart"/>
             <w:r>
               <w:rPr>
                 <w:rFonts w:ascii="Cascadia Mono" w:hAnsi="Cascadia Mono"/>
@@ -8850,7 +8916,6 @@
               </w:rPr>
               <w:t>5</w:t>
             </w:r>
-            <w:proofErr w:type="gramEnd"/>
             <w:r>
               <w:rPr>
                 <w:rFonts w:ascii="Cascadia Mono" w:hAnsi="Cascadia Mono"/>
@@ -8952,7 +9017,6 @@
           <w:noProof/>
           <w:szCs w:val="28"/>
         </w:rPr>
-        <w:lastRenderedPageBreak/>
         <w:drawing>
           <wp:inline distT="0" distB="0" distL="0" distR="0" wp14:anchorId="1A700EAF" wp14:editId="6BE3BF86">
             <wp:extent cx="2971799" cy="1397696"/>
@@ -9246,6 +9310,7 @@
         <w:rPr>
           <w:szCs w:val="28"/>
         </w:rPr>
+        <w:lastRenderedPageBreak/>
         <w:t>Для решения поставленной задачи был составлен следующий запрос:</w:t>
       </w:r>
     </w:p>
@@ -9512,7 +9577,6 @@
         <w:pStyle w:val="a5"/>
       </w:pPr>
       <w:r>
-        <w:lastRenderedPageBreak/>
         <w:t>Формировать запросы было решено на основе данных из двух таблиц</w:t>
       </w:r>
       <w:r>
@@ -9683,16 +9747,7 @@
                 <w:sz w:val="20"/>
                 <w:szCs w:val="20"/>
               </w:rPr>
-              <w:t>список_</w:t>
-            </w:r>
-            <w:proofErr w:type="gramStart"/>
-            <w:r>
-              <w:rPr>
-                <w:rFonts w:ascii="Cascadia Mono" w:hAnsi="Cascadia Mono"/>
-                <w:sz w:val="20"/>
-                <w:szCs w:val="20"/>
-              </w:rPr>
-              <w:t>полей</w:t>
+              <w:t>список_полей</w:t>
             </w:r>
             <w:proofErr w:type="spellEnd"/>
             <w:r>
@@ -9701,16 +9756,7 @@
                 <w:sz w:val="20"/>
                 <w:szCs w:val="20"/>
               </w:rPr>
-              <w:t>&gt;|</w:t>
-            </w:r>
-            <w:proofErr w:type="gramEnd"/>
-            <w:r>
-              <w:rPr>
-                <w:rFonts w:ascii="Cascadia Mono" w:hAnsi="Cascadia Mono"/>
-                <w:sz w:val="20"/>
-                <w:szCs w:val="20"/>
-              </w:rPr>
-              <w:t>&lt;выражение&gt;] FROM &lt;</w:t>
+              <w:t>&gt;|&lt;выражение&gt;] FROM &lt;</w:t>
             </w:r>
             <w:proofErr w:type="spellStart"/>
             <w:r>
@@ -10107,6 +10153,7 @@
         <w:rPr>
           <w:szCs w:val="28"/>
         </w:rPr>
+        <w:lastRenderedPageBreak/>
         <w:t>Результатом запроса стала таблица, состоящая из двух запрошенных полей (рис. 9):</w:t>
       </w:r>
     </w:p>
@@ -10243,56 +10290,28 @@
         </w:rPr>
         <w:t xml:space="preserve"> =</w:t>
       </w:r>
-      <w:proofErr w:type="gramStart"/>
       <w:r>
         <w:rPr>
           <w:rFonts w:ascii="Cascadia Mono" w:hAnsi="Cascadia Mono"/>
           <w:sz w:val="20"/>
           <w:szCs w:val="20"/>
         </w:rPr>
-        <w:t>|&lt;</w:t>
-      </w:r>
-      <w:proofErr w:type="gramEnd"/>
+        <w:t>|&lt;=|=&gt;|&lt;&gt; &lt;</w:t>
+      </w:r>
       <w:r>
         <w:rPr>
           <w:rFonts w:ascii="Cascadia Mono" w:hAnsi="Cascadia Mono"/>
           <w:sz w:val="20"/>
           <w:szCs w:val="20"/>
         </w:rPr>
-        <w:t>=|</w:t>
-      </w:r>
-      <w:proofErr w:type="gramStart"/>
+        <w:t>значение</w:t>
+      </w:r>
       <w:r>
         <w:rPr>
           <w:rFonts w:ascii="Cascadia Mono" w:hAnsi="Cascadia Mono"/>
           <w:sz w:val="20"/>
           <w:szCs w:val="20"/>
         </w:rPr>
-        <w:t>=&gt;|</w:t>
-      </w:r>
-      <w:proofErr w:type="gramEnd"/>
-      <w:r>
-        <w:rPr>
-          <w:rFonts w:ascii="Cascadia Mono" w:hAnsi="Cascadia Mono"/>
-          <w:sz w:val="20"/>
-          <w:szCs w:val="20"/>
-        </w:rPr>
-        <w:t>&lt;&gt; &lt;</w:t>
-      </w:r>
-      <w:r>
-        <w:rPr>
-          <w:rFonts w:ascii="Cascadia Mono" w:hAnsi="Cascadia Mono"/>
-          <w:sz w:val="20"/>
-          <w:szCs w:val="20"/>
-        </w:rPr>
-        <w:t>значение</w:t>
-      </w:r>
-      <w:r>
-        <w:rPr>
-          <w:rFonts w:ascii="Cascadia Mono" w:hAnsi="Cascadia Mono"/>
-          <w:sz w:val="20"/>
-          <w:szCs w:val="20"/>
-        </w:rPr>
         <w:t>&gt;</w:t>
       </w:r>
     </w:p>
@@ -10301,7 +10320,6 @@
         <w:pStyle w:val="a5"/>
       </w:pPr>
       <w:r>
-        <w:lastRenderedPageBreak/>
         <w:t>При этом для получения данных сразу из двух таблиц результат операторов выбора для каждой таблицы и оператора объединения стал выступать в качестве таблицы для запроса с условием. Итоговый текст запроса выглядит следующим образом:</w:t>
       </w:r>
     </w:p>
@@ -10555,7 +10573,11 @@
         <w:t xml:space="preserve"> </w:t>
       </w:r>
       <w:r>
-        <w:t xml:space="preserve">Так как для выбора студентов отличников по всем предметам потребуется проверять оценку сразу для нескольких предметов в предыдущем запросе необходимо изменить условие на множественное. Множественное условие состоит из нескольких условий с логическими операторами </w:t>
+        <w:t xml:space="preserve">Так как для выбора студентов отличников по всем предметам потребуется проверять оценку сразу для нескольких предметов в предыдущем запросе необходимо изменить условие на множественное. Множественное условие состоит из нескольких условий с логическими </w:t>
+      </w:r>
+      <w:r>
+        <w:lastRenderedPageBreak/>
+        <w:t xml:space="preserve">операторами </w:t>
       </w:r>
       <w:r>
         <w:rPr>
@@ -10902,11 +10924,7 @@
       </w:r>
       <w:proofErr w:type="spellEnd"/>
       <w:r>
-        <w:t xml:space="preserve">, возвращающая разницу между двумя датами в заданном формате. Возвращаемое значение функции будет сравниваться с числом 20, а параметрами для функции будут выступать: формат «только </w:t>
-      </w:r>
-      <w:r>
-        <w:lastRenderedPageBreak/>
-        <w:t>год», дата рождения студента, текущая дата. Итоговый запрос выглядит следующим образом:</w:t>
+        <w:t>, возвращающая разницу между двумя датами в заданном формате. Возвращаемое значение функции будет сравниваться с числом 20, а параметрами для функции будут выступать: формат «только год», дата рождения студента, текущая дата. Итоговый запрос выглядит следующим образом:</w:t>
       </w:r>
     </w:p>
     <w:p>
@@ -11057,7 +11075,6 @@
               <w:t>yyyy</w:t>
             </w:r>
             <w:proofErr w:type="spellEnd"/>
-            <w:proofErr w:type="gramStart"/>
             <w:r>
               <w:rPr>
                 <w:rFonts w:ascii="Cascadia Mono" w:hAnsi="Cascadia Mono"/>
@@ -11077,35 +11094,14 @@
               <w:t>ДатаРождения</w:t>
             </w:r>
             <w:proofErr w:type="spellEnd"/>
-            <w:proofErr w:type="gramEnd"/>
-            <w:r>
-              <w:rPr>
-                <w:rFonts w:ascii="Cascadia Mono" w:hAnsi="Cascadia Mono"/>
-                <w:sz w:val="20"/>
-                <w:szCs w:val="20"/>
-                <w:lang w:val="en-US"/>
-              </w:rPr>
-              <w:t>,</w:t>
-            </w:r>
-            <w:proofErr w:type="gramStart"/>
-            <w:r>
-              <w:rPr>
-                <w:rFonts w:ascii="Cascadia Mono" w:hAnsi="Cascadia Mono"/>
-                <w:sz w:val="20"/>
-                <w:szCs w:val="20"/>
-                <w:lang w:val="en-US"/>
-              </w:rPr>
-              <w:t>Date(</w:t>
-            </w:r>
-            <w:proofErr w:type="gramEnd"/>
-            <w:r>
-              <w:rPr>
-                <w:rFonts w:ascii="Cascadia Mono" w:hAnsi="Cascadia Mono"/>
-                <w:sz w:val="20"/>
-                <w:szCs w:val="20"/>
-                <w:lang w:val="en-US"/>
-              </w:rPr>
-              <w:t>)) &gt;= 20;</w:t>
+            <w:r>
+              <w:rPr>
+                <w:rFonts w:ascii="Cascadia Mono" w:hAnsi="Cascadia Mono"/>
+                <w:sz w:val="20"/>
+                <w:szCs w:val="20"/>
+                <w:lang w:val="en-US"/>
+              </w:rPr>
+              <w:t>,Date()) &gt;= 20;</w:t>
             </w:r>
           </w:p>
         </w:tc>
@@ -11241,6 +11237,7 @@
         <w:ind w:left="1380"/>
       </w:pPr>
       <w:r>
+        <w:lastRenderedPageBreak/>
         <w:t>а) студентов с фамилией «Иванов»;</w:t>
       </w:r>
     </w:p>
@@ -11412,33 +11409,19 @@
         <w:rPr>
           <w:szCs w:val="28"/>
         </w:rPr>
-        <w:t xml:space="preserve"> это </w:t>
-      </w:r>
-      <w:proofErr w:type="gramStart"/>
+        <w:t xml:space="preserve"> это «</w:t>
+      </w:r>
       <w:r>
         <w:rPr>
           <w:szCs w:val="28"/>
         </w:rPr>
-        <w:t>«</w:t>
+        <w:t>:</w:t>
       </w:r>
       <w:r>
         <w:rPr>
           <w:szCs w:val="28"/>
         </w:rPr>
-        <w:t>:</w:t>
-      </w:r>
-      <w:r>
-        <w:rPr>
-          <w:szCs w:val="28"/>
-        </w:rPr>
-        <w:t>имя</w:t>
-      </w:r>
-      <w:proofErr w:type="gramEnd"/>
-      <w:r>
-        <w:rPr>
-          <w:szCs w:val="28"/>
-        </w:rPr>
-        <w:t>».</w:t>
+        <w:t>имя».</w:t>
       </w:r>
     </w:p>
     <w:p>
@@ -12644,6 +12627,119 @@
       </w:rPr>
     </w:lvl>
   </w:abstractNum>
+  <w:abstractNum w:abstractNumId="10" w15:restartNumberingAfterBreak="0">
+    <w:nsid w:val="7B012A1E"/>
+    <w:multiLevelType w:val="hybridMultilevel"/>
+    <w:tmpl w:val="F7DA1108"/>
+    <w:lvl w:ilvl="0" w:tplc="04190001">
+      <w:start w:val="1"/>
+      <w:numFmt w:val="bullet"/>
+      <w:lvlText w:val=""/>
+      <w:lvlJc w:val="left"/>
+      <w:pPr>
+        <w:ind w:left="720" w:hanging="360"/>
+      </w:pPr>
+      <w:rPr>
+        <w:rFonts w:ascii="Symbol" w:hAnsi="Symbol" w:hint="default"/>
+      </w:rPr>
+    </w:lvl>
+    <w:lvl w:ilvl="1" w:tplc="04190003" w:tentative="1">
+      <w:start w:val="1"/>
+      <w:numFmt w:val="bullet"/>
+      <w:lvlText w:val="o"/>
+      <w:lvlJc w:val="left"/>
+      <w:pPr>
+        <w:ind w:left="1440" w:hanging="360"/>
+      </w:pPr>
+      <w:rPr>
+        <w:rFonts w:ascii="Courier New" w:hAnsi="Courier New" w:cs="Courier New" w:hint="default"/>
+      </w:rPr>
+    </w:lvl>
+    <w:lvl w:ilvl="2" w:tplc="04190005" w:tentative="1">
+      <w:start w:val="1"/>
+      <w:numFmt w:val="bullet"/>
+      <w:lvlText w:val=""/>
+      <w:lvlJc w:val="left"/>
+      <w:pPr>
+        <w:ind w:left="2160" w:hanging="360"/>
+      </w:pPr>
+      <w:rPr>
+        <w:rFonts w:ascii="Wingdings" w:hAnsi="Wingdings" w:hint="default"/>
+      </w:rPr>
+    </w:lvl>
+    <w:lvl w:ilvl="3" w:tplc="04190001" w:tentative="1">
+      <w:start w:val="1"/>
+      <w:numFmt w:val="bullet"/>
+      <w:lvlText w:val=""/>
+      <w:lvlJc w:val="left"/>
+      <w:pPr>
+        <w:ind w:left="2880" w:hanging="360"/>
+      </w:pPr>
+      <w:rPr>
+        <w:rFonts w:ascii="Symbol" w:hAnsi="Symbol" w:hint="default"/>
+      </w:rPr>
+    </w:lvl>
+    <w:lvl w:ilvl="4" w:tplc="04190003" w:tentative="1">
+      <w:start w:val="1"/>
+      <w:numFmt w:val="bullet"/>
+      <w:lvlText w:val="o"/>
+      <w:lvlJc w:val="left"/>
+      <w:pPr>
+        <w:ind w:left="3600" w:hanging="360"/>
+      </w:pPr>
+      <w:rPr>
+        <w:rFonts w:ascii="Courier New" w:hAnsi="Courier New" w:cs="Courier New" w:hint="default"/>
+      </w:rPr>
+    </w:lvl>
+    <w:lvl w:ilvl="5" w:tplc="04190005" w:tentative="1">
+      <w:start w:val="1"/>
+      <w:numFmt w:val="bullet"/>
+      <w:lvlText w:val=""/>
+      <w:lvlJc w:val="left"/>
+      <w:pPr>
+        <w:ind w:left="4320" w:hanging="360"/>
+      </w:pPr>
+      <w:rPr>
+        <w:rFonts w:ascii="Wingdings" w:hAnsi="Wingdings" w:hint="default"/>
+      </w:rPr>
+    </w:lvl>
+    <w:lvl w:ilvl="6" w:tplc="04190001" w:tentative="1">
+      <w:start w:val="1"/>
+      <w:numFmt w:val="bullet"/>
+      <w:lvlText w:val=""/>
+      <w:lvlJc w:val="left"/>
+      <w:pPr>
+        <w:ind w:left="5040" w:hanging="360"/>
+      </w:pPr>
+      <w:rPr>
+        <w:rFonts w:ascii="Symbol" w:hAnsi="Symbol" w:hint="default"/>
+      </w:rPr>
+    </w:lvl>
+    <w:lvl w:ilvl="7" w:tplc="04190003" w:tentative="1">
+      <w:start w:val="1"/>
+      <w:numFmt w:val="bullet"/>
+      <w:lvlText w:val="o"/>
+      <w:lvlJc w:val="left"/>
+      <w:pPr>
+        <w:ind w:left="5760" w:hanging="360"/>
+      </w:pPr>
+      <w:rPr>
+        <w:rFonts w:ascii="Courier New" w:hAnsi="Courier New" w:cs="Courier New" w:hint="default"/>
+      </w:rPr>
+    </w:lvl>
+    <w:lvl w:ilvl="8" w:tplc="04190005" w:tentative="1">
+      <w:start w:val="1"/>
+      <w:numFmt w:val="bullet"/>
+      <w:lvlText w:val=""/>
+      <w:lvlJc w:val="left"/>
+      <w:pPr>
+        <w:ind w:left="6480" w:hanging="360"/>
+      </w:pPr>
+      <w:rPr>
+        <w:rFonts w:ascii="Wingdings" w:hAnsi="Wingdings" w:hint="default"/>
+      </w:rPr>
+    </w:lvl>
+  </w:abstractNum>
   <w:num w:numId="1" w16cid:durableId="1011758383">
     <w:abstractNumId w:val="2"/>
   </w:num>
@@ -12673,6 +12769,9 @@
   </w:num>
   <w:num w:numId="10" w16cid:durableId="1493373267">
     <w:abstractNumId w:val="4"/>
+  </w:num>
+  <w:num w:numId="11" w16cid:durableId="1072893548">
+    <w:abstractNumId w:val="10"/>
   </w:num>
 </w:numbering>
 </file>

</xml_diff>